<commit_message>
Revise environmental scanning report against grading rubric
Restructure around the five rubric criteria, add PESTEL, competitor and
recommendation tables, correct the 2025 cross-border travel figure, and
add a PDF copy (4 pages).

Co-Authored-By: Claude Opus 5.5 <noreply@anthropic.com>
Claude-Session: https://claude.ai/code/session_01JTamVxrTv7V6U77E6LC8gu
</commit_message>
<xml_diff>
--- a/MGMT6121/Environmental_Scanning_Hospitality_Canada.docx
+++ b/MGMT6121/Environmental_Scanning_Hospitality_Canada.docx
@@ -11,6 +11,7 @@
         <w:rPr>
           <w:b/>
           <w:i w:val="0"/>
+          <w:color w:val="1F3A5F"/>
           <w:sz w:val="30"/>
         </w:rPr>
         <w:t>Environmental Scanning: The Canadian Hospitality Industry (Hotels &amp; Restaurants)</w:t>
@@ -31,7 +32,7 @@
     </w:p>
     <w:p>
       <w:pPr>
-        <w:spacing w:after="160"/>
+        <w:spacing w:after="120"/>
         <w:jc w:val="center"/>
       </w:pPr>
       <w:r>
@@ -39,12 +40,13 @@
           <w:i w:val="0"/>
           <w:sz w:val="20"/>
         </w:rPr>
-        <w:t>MGMT6121 Business Intelligence, Fanshawe College   |   [Professor Name]   |   [Submission Date]</w:t>
+        <w:t>MGMT6121 Business Intelligence (Online), Fanshawe College   |   Professor: [Name]   |   [Date]</w:t>
       </w:r>
     </w:p>
     <w:p>
       <w:pPr>
-        <w:spacing w:before="160" w:after="60"/>
+        <w:keepNext/>
+        <w:spacing w:before="140" w:after="60"/>
       </w:pPr>
       <w:r>
         <w:rPr>
@@ -52,7 +54,7 @@
           <w:color w:val="1F3A5F"/>
           <w:sz w:val="25"/>
         </w:rPr>
-        <w:t>1. Industry Overview</w:t>
+        <w:t>1. Introduction and Industry Snapshot</w:t>
       </w:r>
     </w:p>
     <w:p>
@@ -60,12 +62,21 @@
         <w:rPr>
           <w:i w:val="0"/>
         </w:rPr>
-        <w:t>Canada’s hospitality sector covers two closely linked businesses: places that put people up for the night and places that feed them. On paper, 2025 looked like a good year. Canadian hotels posted their best annual results on record, with occupancy of 66.1%, an average daily rate (ADR) of $216.10 and RevPAR of $142.89 (CoStar, 2026a). Restaurants told a different story. Sales grew, but costs grew faster, and by mid-2026 about 41% of operators said they were losing money or just breaking even (Restaurants Canada, 2026b). That gap between strong top-line numbers and thin margins is the main thread running through this scan. Below, I break down the external forces behind it, the competitors shaping the market, what customers are doing differently, and where operators can respond.</w:t>
+        <w:t>This report scans the external environment of Canada’s hospitality industry, defined here as accommodation (hotels and resorts) and foodservice (quick-service, full-service and independent restaurants). The evidence comes from industry associations (Restaurants Canada, Hotels Canada), market data (CoStar), Statistics Canada, company filings, news coverage and consumer conversations on Reddit and TikTok.</w:t>
+      </w:r>
+    </w:p>
+    <w:p>
+      <w:r>
+        <w:rPr>
+          <w:i w:val="0"/>
+        </w:rPr>
+        <w:t>The main finding is that demand is holding up, but profitability is not. Hotels had their best year on record in 2025, with occupancy of 66.1%, an average daily rate (ADR) of $216.10 and revenue per available room (RevPAR) of $142.89 (CoStar, 2026a). Restaurants are in a weaker position. Total foodservice sales are forecast to grow only 2.1% in 2026, and 41% of operators say they are losing money or breaking even (Foodservice and Hospitality, 2026; Restaurants Canada, 2026). The sections below explain the forces behind this gap and how operators can respond.</w:t>
       </w:r>
     </w:p>
     <w:p>
       <w:pPr>
-        <w:spacing w:before="160" w:after="60"/>
+        <w:keepNext/>
+        <w:spacing w:before="140" w:after="60"/>
       </w:pPr>
       <w:r>
         <w:rPr>
@@ -73,87 +84,388 @@
           <w:color w:val="1F3A5F"/>
           <w:sz w:val="25"/>
         </w:rPr>
-        <w:t>2. Key External Factors (PESTEL Summary)</w:t>
+        <w:t>2. Key External Factors</w:t>
       </w:r>
     </w:p>
     <w:p>
       <w:pPr>
-        <w:pStyle w:val="ListBullet"/>
         <w:spacing w:after="60"/>
       </w:pPr>
       <w:r>
         <w:rPr>
-          <w:b/>
+          <w:i w:val="0"/>
         </w:rPr>
-        <w:t xml:space="preserve">Economic: </w:t>
+        <w:t>Table 1 summarizes the most important external influences, the evidence behind each one, and what it means for hotels and restaurants.</w:t>
       </w:r>
+    </w:p>
+    <w:tbl>
+      <w:tblPr>
+        <w:tblStyle w:val="TableGrid"/>
+        <w:tblW w:type="auto" w:w="0"/>
+        <w:tblLayout w:type="fixed"/>
+        <w:tblLook w:firstColumn="1" w:firstRow="1" w:lastColumn="0" w:lastRow="0" w:noHBand="0" w:noVBand="1" w:val="04A0"/>
+      </w:tblPr>
+      <w:tblGrid>
+        <w:gridCol w:w="1728"/>
+        <w:gridCol w:w="4680"/>
+        <w:gridCol w:w="3600"/>
+      </w:tblGrid>
+      <w:tr>
+        <w:trPr>
+          <w:tblHeader w:val="true"/>
+        </w:trPr>
+        <w:tc>
+          <w:tcPr>
+            <w:tcW w:type="dxa" w:w="1728"/>
+            <w:shd w:val="clear" w:color="auto" w:fill="1F3A5F"/>
+          </w:tcPr>
+          <w:p>
+            <w:pPr>
+              <w:spacing w:after="0" w:line="240" w:lineRule="auto"/>
+            </w:pPr>
+            <w:r/>
+            <w:r>
+              <w:rPr>
+                <w:b/>
+                <w:color w:val="FFFFFF"/>
+                <w:sz w:val="18"/>
+              </w:rPr>
+              <w:t>Factor</w:t>
+            </w:r>
+          </w:p>
+        </w:tc>
+        <w:tc>
+          <w:tcPr>
+            <w:tcW w:type="dxa" w:w="4680"/>
+            <w:shd w:val="clear" w:color="auto" w:fill="1F3A5F"/>
+          </w:tcPr>
+          <w:p>
+            <w:pPr>
+              <w:spacing w:after="0" w:line="240" w:lineRule="auto"/>
+            </w:pPr>
+            <w:r/>
+            <w:r>
+              <w:rPr>
+                <w:b/>
+                <w:color w:val="FFFFFF"/>
+                <w:sz w:val="18"/>
+              </w:rPr>
+              <w:t>Current development (evidence)</w:t>
+            </w:r>
+          </w:p>
+        </w:tc>
+        <w:tc>
+          <w:tcPr>
+            <w:tcW w:type="dxa" w:w="3600"/>
+            <w:shd w:val="clear" w:color="auto" w:fill="1F3A5F"/>
+          </w:tcPr>
+          <w:p>
+            <w:pPr>
+              <w:spacing w:after="0" w:line="240" w:lineRule="auto"/>
+            </w:pPr>
+            <w:r/>
+            <w:r>
+              <w:rPr>
+                <w:b/>
+                <w:color w:val="FFFFFF"/>
+                <w:sz w:val="18"/>
+              </w:rPr>
+              <w:t>Impact on the industry</w:t>
+            </w:r>
+          </w:p>
+        </w:tc>
+      </w:tr>
+      <w:tr>
+        <w:tc>
+          <w:tcPr>
+            <w:tcW w:type="dxa" w:w="1728"/>
+            <w:shd w:val="clear" w:color="auto" w:fill="E8EEF5"/>
+          </w:tcPr>
+          <w:p>
+            <w:pPr>
+              <w:spacing w:after="0" w:line="240" w:lineRule="auto"/>
+            </w:pPr>
+            <w:r/>
+            <w:r>
+              <w:rPr>
+                <w:b/>
+                <w:sz w:val="18"/>
+              </w:rPr>
+              <w:t>Economic</w:t>
+            </w:r>
+          </w:p>
+        </w:tc>
+        <w:tc>
+          <w:tcPr>
+            <w:tcW w:type="dxa" w:w="4680"/>
+          </w:tcPr>
+          <w:p>
+            <w:pPr>
+              <w:spacing w:after="0" w:line="240" w:lineRule="auto"/>
+            </w:pPr>
+            <w:r/>
+            <w:r>
+              <w:rPr>
+                <w:sz w:val="18"/>
+              </w:rPr>
+              <w:t>Food costs are a top concern for 88% of restaurant operators and labour costs for 89%. Two one-time boosts to 2025 sales, the GST/HST holiday and travel money spent at home instead of in the U.S., are fading in 2026 (Foodservice and Hospitality, 2026; Restaurants Canada, 2026). Hotel growth now comes mostly from price: in June 2026, occupancy fell 3.5% while ADR rose 5.4% (CoStar, 2026b).</w:t>
+            </w:r>
+          </w:p>
+        </w:tc>
+        <w:tc>
+          <w:tcPr>
+            <w:tcW w:type="dxa" w:w="3600"/>
+          </w:tcPr>
+          <w:p>
+            <w:pPr>
+              <w:spacing w:after="0" w:line="240" w:lineRule="auto"/>
+            </w:pPr>
+            <w:r/>
+            <w:r>
+              <w:rPr>
+                <w:sz w:val="18"/>
+              </w:rPr>
+              <w:t>Margins are being squeezed from both sides. Restaurants cannot raise prices much further without losing value-conscious guests, and hotels cannot rely on rate increases if fewer rooms are filled.</w:t>
+            </w:r>
+          </w:p>
+        </w:tc>
+      </w:tr>
+      <w:tr>
+        <w:tc>
+          <w:tcPr>
+            <w:tcW w:type="dxa" w:w="1728"/>
+            <w:shd w:val="clear" w:color="auto" w:fill="E8EEF5"/>
+          </w:tcPr>
+          <w:p>
+            <w:pPr>
+              <w:spacing w:after="0" w:line="240" w:lineRule="auto"/>
+            </w:pPr>
+            <w:r/>
+            <w:r>
+              <w:rPr>
+                <w:b/>
+                <w:sz w:val="18"/>
+              </w:rPr>
+              <w:t>Political and legal</w:t>
+            </w:r>
+          </w:p>
+        </w:tc>
+        <w:tc>
+          <w:tcPr>
+            <w:tcW w:type="dxa" w:w="4680"/>
+          </w:tcPr>
+          <w:p>
+            <w:pPr>
+              <w:spacing w:after="0" w:line="240" w:lineRule="auto"/>
+            </w:pPr>
+            <w:r/>
+            <w:r>
+              <w:rPr>
+                <w:sz w:val="18"/>
+              </w:rPr>
+              <w:t>Because of the tariff dispute, Canadian return trips from the U.S. fell 25.4% to 29.1 million in 2025 (Statistics Canada, 2026a), and the decline continued for a 14th straight month in February 2026 (Statistics Canada, 2026b). Ottawa continues to cut temporary resident numbers (The Hill Times, 2026). Minimum wages rise each year with inflation: the federal rate is $18.15 (April 2026), B.C. $18.25 (June 2026) and Ontario $17.95 (October 2026) (Littler, 2026). The Competition Act now bans drip pricing, and Quebec’s Law 25 tightens consent rules for personal data.</w:t>
+            </w:r>
+          </w:p>
+        </w:tc>
+        <w:tc>
+          <w:tcPr>
+            <w:tcW w:type="dxa" w:w="3600"/>
+          </w:tcPr>
+          <w:p>
+            <w:pPr>
+              <w:spacing w:after="0" w:line="240" w:lineRule="auto"/>
+            </w:pPr>
+            <w:r/>
+            <w:r>
+              <w:rPr>
+                <w:sz w:val="18"/>
+              </w:rPr>
+              <w:t>Domestic demand gets a boost, but labour costs go up while the supply of workers shrinks. Advertised prices must include mandatory fees, such as resort fees. Collecting guest data for analytics now requires clear consent.</w:t>
+            </w:r>
+          </w:p>
+        </w:tc>
+      </w:tr>
+      <w:tr>
+        <w:tc>
+          <w:tcPr>
+            <w:tcW w:type="dxa" w:w="1728"/>
+            <w:shd w:val="clear" w:color="auto" w:fill="E8EEF5"/>
+          </w:tcPr>
+          <w:p>
+            <w:pPr>
+              <w:spacing w:after="0" w:line="240" w:lineRule="auto"/>
+            </w:pPr>
+            <w:r/>
+            <w:r>
+              <w:rPr>
+                <w:b/>
+                <w:sz w:val="18"/>
+              </w:rPr>
+              <w:t>Social</w:t>
+            </w:r>
+          </w:p>
+        </w:tc>
+        <w:tc>
+          <w:tcPr>
+            <w:tcW w:type="dxa" w:w="4680"/>
+          </w:tcPr>
+          <w:p>
+            <w:pPr>
+              <w:spacing w:after="0" w:line="240" w:lineRule="auto"/>
+            </w:pPr>
+            <w:r/>
+            <w:r>
+              <w:rPr>
+                <w:sz w:val="18"/>
+              </w:rPr>
+              <w:t>83% of Canadians say too many businesses ask for tips, and 59% would prefer a no-tipping model with higher wages (Angus Reid Institute, 2023). The “Buy Canadian” movement has rewarded Canadian-owned brands. A&amp;W’s “Canadian owned and managed” signage was widely praised online (NOW Toronto, 2025). Reddit threads such as r/PersonalFinanceCanada are full of people cutting back on dining out.</w:t>
+            </w:r>
+          </w:p>
+        </w:tc>
+        <w:tc>
+          <w:tcPr>
+            <w:tcW w:type="dxa" w:w="3600"/>
+          </w:tcPr>
+          <w:p>
+            <w:pPr>
+              <w:spacing w:after="0" w:line="240" w:lineRule="auto"/>
+            </w:pPr>
+            <w:r/>
+            <w:r>
+              <w:rPr>
+                <w:sz w:val="18"/>
+              </w:rPr>
+              <w:t>Guests choose more carefully and expect honest, transparent pricing. Local identity is now a real source of competitive advantage.</w:t>
+            </w:r>
+          </w:p>
+        </w:tc>
+      </w:tr>
+      <w:tr>
+        <w:tc>
+          <w:tcPr>
+            <w:tcW w:type="dxa" w:w="1728"/>
+            <w:shd w:val="clear" w:color="auto" w:fill="E8EEF5"/>
+          </w:tcPr>
+          <w:p>
+            <w:pPr>
+              <w:spacing w:after="0" w:line="240" w:lineRule="auto"/>
+            </w:pPr>
+            <w:r/>
+            <w:r>
+              <w:rPr>
+                <w:b/>
+                <w:sz w:val="18"/>
+              </w:rPr>
+              <w:t>Technological</w:t>
+            </w:r>
+          </w:p>
+        </w:tc>
+        <w:tc>
+          <w:tcPr>
+            <w:tcW w:type="dxa" w:w="4680"/>
+          </w:tcPr>
+          <w:p>
+            <w:pPr>
+              <w:spacing w:after="0" w:line="240" w:lineRule="auto"/>
+            </w:pPr>
+            <w:r/>
+            <w:r>
+              <w:rPr>
+                <w:sz w:val="18"/>
+              </w:rPr>
+              <w:t>79% of independent Canadian restaurant operators feel positive about using AI (TouchBistro, 2026). Self-order kiosks, mobile ordering, digital room keys, chatbots and automated revenue-management systems are becoming standard.</w:t>
+            </w:r>
+          </w:p>
+        </w:tc>
+        <w:tc>
+          <w:tcPr>
+            <w:tcW w:type="dxa" w:w="3600"/>
+          </w:tcPr>
+          <w:p>
+            <w:pPr>
+              <w:spacing w:after="0" w:line="240" w:lineRule="auto"/>
+            </w:pPr>
+            <w:r/>
+            <w:r>
+              <w:rPr>
+                <w:sz w:val="18"/>
+              </w:rPr>
+              <w:t>Technology reduces dependence on scarce labour and produces large amounts of data, but many operators still do not turn that data into decisions.</w:t>
+            </w:r>
+          </w:p>
+        </w:tc>
+      </w:tr>
+      <w:tr>
+        <w:tc>
+          <w:tcPr>
+            <w:tcW w:type="dxa" w:w="1728"/>
+            <w:shd w:val="clear" w:color="auto" w:fill="E8EEF5"/>
+          </w:tcPr>
+          <w:p>
+            <w:pPr>
+              <w:spacing w:after="0" w:line="240" w:lineRule="auto"/>
+            </w:pPr>
+            <w:r/>
+            <w:r>
+              <w:rPr>
+                <w:b/>
+                <w:sz w:val="18"/>
+              </w:rPr>
+              <w:t>Environmental</w:t>
+            </w:r>
+          </w:p>
+        </w:tc>
+        <w:tc>
+          <w:tcPr>
+            <w:tcW w:type="dxa" w:w="4680"/>
+          </w:tcPr>
+          <w:p>
+            <w:pPr>
+              <w:spacing w:after="0" w:line="240" w:lineRule="auto"/>
+            </w:pPr>
+            <w:r/>
+            <w:r>
+              <w:rPr>
+                <w:sz w:val="18"/>
+              </w:rPr>
+              <w:t>The 2024 Jasper wildfire destroyed hundreds of structures and shut a major resort town during peak season. Wildfire smoke, extreme weather and federal rules on single-use plastics now shape operations. Corporate travel buyers increasingly ask about food waste and energy use.</w:t>
+            </w:r>
+          </w:p>
+        </w:tc>
+        <w:tc>
+          <w:tcPr>
+            <w:tcW w:type="dxa" w:w="3600"/>
+          </w:tcPr>
+          <w:p>
+            <w:pPr>
+              <w:spacing w:after="0" w:line="240" w:lineRule="auto"/>
+            </w:pPr>
+            <w:r/>
+            <w:r>
+              <w:rPr>
+                <w:sz w:val="18"/>
+              </w:rPr>
+              <w:t>Seasonal revenue becomes harder to predict, insurance and compliance costs rise, and sustainability becomes a factor when clients choose a venue.</w:t>
+            </w:r>
+          </w:p>
+        </w:tc>
+      </w:tr>
+    </w:tbl>
+    <w:p>
+      <w:pPr>
+        <w:spacing w:before="80"/>
+      </w:pPr>
       <w:r>
-        <w:t>Food costs are a top worry for 88% of restaurant operators and labour costs for 89% (Restaurants Canada, 2026b). Restaurants Canada expects total foodservice sales to grow only 2.1% in 2026, partly because two temporary boosts from 2025 have faded: the GST/HST holiday and the money Canadians spent at home instead of travelling south (Restaurants Canada, 2026a). Hotels are still growing revenue, but mostly through price. In June 2026, occupancy fell 3.5% while ADR rose 5.4% (CoStar, 2026b). Pushing rates while fewer rooms are filled can only go on for so long.</w:t>
+        <w:rPr>
+          <w:i w:val="0"/>
+        </w:rPr>
+        <w:t>Taken together, these factors show an industry where demand is shifting toward domestic and value-conscious guests just as operating costs and labour constraints become harder to manage.</w:t>
       </w:r>
     </w:p>
     <w:p>
       <w:pPr>
-        <w:pStyle w:val="ListBullet"/>
-        <w:spacing w:after="60"/>
-      </w:pPr>
-      <w:r>
-        <w:rPr>
-          <w:b/>
-        </w:rPr>
-        <w:t xml:space="preserve">Political/Legal: </w:t>
-      </w:r>
-      <w:r>
-        <w:t>U.S. tariffs and the cross-border tension that followed changed how Canadians travel. Canadian trips to the U.S. fell from about 39 million in 2024 to roughly 23 million in 2025, and return trips were still down year over year in early 2026, the 14th straight monthly decline by February (Statistics Canada, 2026). Ottawa also tightened the Temporary Foreign Worker (TFW) Program, which hotels and quick-service chains have leaned on heavily. On top of that, provincial short-term rental rules (such as B.C.’s principal-residence requirement) and the federal ban on drip pricing affect how hotels compete and how they display fees.</w:t>
-      </w:r>
-    </w:p>
-    <w:p>
-      <w:pPr>
-        <w:pStyle w:val="ListBullet"/>
-        <w:spacing w:after="60"/>
-      </w:pPr>
-      <w:r>
-        <w:rPr>
-          <w:b/>
-        </w:rPr>
-        <w:t xml:space="preserve">Social: </w:t>
-      </w:r>
-      <w:r>
-        <w:t>Diners are more careful with money and very aware of value. Online, complaints about “tipflation” and pre-set tip screens of 18% to 25% come up constantly, and Reddit threads like r/PersonalFinanceCanada are full of people saying they eat out less. At the same time, the “Buy Canadian” movement turned national pride into a reason to buy, and the brands that leaned into it, like A&amp;W Canada, got noticed.</w:t>
-      </w:r>
-    </w:p>
-    <w:p>
-      <w:pPr>
-        <w:pStyle w:val="ListBullet"/>
-        <w:spacing w:after="60"/>
-      </w:pPr>
-      <w:r>
-        <w:rPr>
-          <w:b/>
-        </w:rPr>
-        <w:t xml:space="preserve">Technological: </w:t>
-      </w:r>
-      <w:r>
-        <w:t>Mobile ordering, self-serve kiosks, loyalty apps, dynamic pricing and AI chatbots are becoming normal. The real gap now is less about who has the tools and more about who actually uses the data those tools produce.</w:t>
-      </w:r>
-    </w:p>
-    <w:p>
-      <w:pPr>
-        <w:pStyle w:val="ListBullet"/>
-        <w:spacing w:after="60"/>
-      </w:pPr>
-      <w:r>
-        <w:rPr>
-          <w:b/>
-        </w:rPr>
-        <w:t xml:space="preserve">Environmental: </w:t>
-      </w:r>
-      <w:r>
-        <w:t>Climate events now hit revenue directly. The 2024 Jasper wildfire closed one of the country’s best-known resort towns in peak season, and smoke-filled summers keep threatening outdoor dining and mountain tourism. Guests and corporate travel buyers are also asking more questions about sustainability, from food waste to energy use.</w:t>
-      </w:r>
-    </w:p>
-    <w:p>
-      <w:pPr>
-        <w:spacing w:before="160" w:after="60"/>
+        <w:keepNext/>
+        <w:spacing w:before="140" w:after="60"/>
       </w:pPr>
       <w:r>
         <w:rPr>
@@ -166,40 +478,46 @@
     </w:p>
     <w:p>
       <w:pPr>
-        <w:spacing w:after="80"/>
+        <w:spacing w:after="60"/>
       </w:pPr>
       <w:r>
         <w:rPr>
           <w:i w:val="0"/>
         </w:rPr>
-        <w:t>The market is split between large, well-funded chains and a long tail of independents. The table below summarizes the major players and what they have done recently.</w:t>
+        <w:t>The market is split between large, well-funded chains and a long tail of independent operators. All of them are also competing with platforms and substitutes. Table 2 profiles the major players.</w:t>
       </w:r>
     </w:p>
     <w:tbl>
       <w:tblPr>
-        <w:tblStyle w:val="LightGrid-Accent1"/>
+        <w:tblStyle w:val="TableGrid"/>
         <w:tblW w:type="auto" w:w="0"/>
+        <w:tblLayout w:type="fixed"/>
         <w:tblLook w:firstColumn="1" w:firstRow="1" w:lastColumn="0" w:lastRow="0" w:noHBand="0" w:noVBand="1" w:val="04A0"/>
       </w:tblPr>
       <w:tblGrid>
-        <w:gridCol w:w="2340"/>
-        <w:gridCol w:w="2340"/>
-        <w:gridCol w:w="2340"/>
-        <w:gridCol w:w="2340"/>
+        <w:gridCol w:w="1728"/>
+        <w:gridCol w:w="2664"/>
+        <w:gridCol w:w="2520"/>
+        <w:gridCol w:w="3096"/>
       </w:tblGrid>
       <w:tr>
+        <w:trPr>
+          <w:tblHeader w:val="true"/>
+        </w:trPr>
         <w:tc>
           <w:tcPr>
-            <w:tcW w:type="dxa" w:w="1800"/>
+            <w:tcW w:type="dxa" w:w="1728"/>
+            <w:shd w:val="clear" w:color="auto" w:fill="1F3A5F"/>
           </w:tcPr>
           <w:p>
             <w:pPr>
-              <w:spacing w:after="0"/>
+              <w:spacing w:after="0" w:line="240" w:lineRule="auto"/>
             </w:pPr>
             <w:r/>
             <w:r>
               <w:rPr>
                 <w:b/>
+                <w:color w:val="FFFFFF"/>
                 <w:sz w:val="18"/>
               </w:rPr>
               <w:t>Competitor</w:t>
@@ -208,16 +526,18 @@
         </w:tc>
         <w:tc>
           <w:tcPr>
-            <w:tcW w:type="dxa" w:w="2304"/>
+            <w:tcW w:type="dxa" w:w="2664"/>
+            <w:shd w:val="clear" w:color="auto" w:fill="1F3A5F"/>
           </w:tcPr>
           <w:p>
             <w:pPr>
-              <w:spacing w:after="0"/>
+              <w:spacing w:after="0" w:line="240" w:lineRule="auto"/>
             </w:pPr>
             <w:r/>
             <w:r>
               <w:rPr>
                 <w:b/>
+                <w:color w:val="FFFFFF"/>
                 <w:sz w:val="18"/>
               </w:rPr>
               <w:t>Strengths</w:t>
@@ -226,16 +546,18 @@
         </w:tc>
         <w:tc>
           <w:tcPr>
-            <w:tcW w:type="dxa" w:w="2304"/>
+            <w:tcW w:type="dxa" w:w="2520"/>
+            <w:shd w:val="clear" w:color="auto" w:fill="1F3A5F"/>
           </w:tcPr>
           <w:p>
             <w:pPr>
-              <w:spacing w:after="0"/>
+              <w:spacing w:after="0" w:line="240" w:lineRule="auto"/>
             </w:pPr>
             <w:r/>
             <w:r>
               <w:rPr>
                 <w:b/>
+                <w:color w:val="FFFFFF"/>
                 <w:sz w:val="18"/>
               </w:rPr>
               <w:t>Weaknesses</w:t>
@@ -244,11 +566,34 @@
         </w:tc>
         <w:tc>
           <w:tcPr>
-            <w:tcW w:type="dxa" w:w="2952"/>
+            <w:tcW w:type="dxa" w:w="3096"/>
+            <w:shd w:val="clear" w:color="auto" w:fill="1F3A5F"/>
           </w:tcPr>
           <w:p>
             <w:pPr>
-              <w:spacing w:after="0"/>
+              <w:spacing w:after="0" w:line="240" w:lineRule="auto"/>
+            </w:pPr>
+            <w:r/>
+            <w:r>
+              <w:rPr>
+                <w:b/>
+                <w:color w:val="FFFFFF"/>
+                <w:sz w:val="18"/>
+              </w:rPr>
+              <w:t>Recent strategic moves</w:t>
+            </w:r>
+          </w:p>
+        </w:tc>
+      </w:tr>
+      <w:tr>
+        <w:tc>
+          <w:tcPr>
+            <w:tcW w:type="dxa" w:w="1728"/>
+            <w:shd w:val="clear" w:color="auto" w:fill="E8EEF5"/>
+          </w:tcPr>
+          <w:p>
+            <w:pPr>
+              <w:spacing w:after="0" w:line="240" w:lineRule="auto"/>
             </w:pPr>
             <w:r/>
             <w:r>
@@ -256,60 +601,38 @@
                 <w:b/>
                 <w:sz w:val="18"/>
               </w:rPr>
-              <w:t>Recent Strategic Moves</w:t>
-            </w:r>
-          </w:p>
-        </w:tc>
-      </w:tr>
-      <w:tr>
-        <w:tc>
-          <w:tcPr>
-            <w:tcW w:type="dxa" w:w="1800"/>
-          </w:tcPr>
-          <w:p>
-            <w:pPr>
-              <w:spacing w:after="0"/>
-            </w:pPr>
-            <w:r/>
-            <w:r>
-              <w:rPr>
-                <w:b/>
-                <w:sz w:val="18"/>
-              </w:rPr>
-              <w:t>Tim Hortons (RBI)</w:t>
+              <w:t>Tim Hortons (Restaurant Brands International)</w:t>
             </w:r>
           </w:p>
         </w:tc>
         <w:tc>
           <w:tcPr>
-            <w:tcW w:type="dxa" w:w="2304"/>
+            <w:tcW w:type="dxa" w:w="2664"/>
           </w:tcPr>
           <w:p>
             <w:pPr>
-              <w:spacing w:after="0"/>
+              <w:spacing w:after="0" w:line="240" w:lineRule="auto"/>
             </w:pPr>
             <w:r/>
             <w:r>
               <w:rPr>
-                <w:b w:val="0"/>
                 <w:sz w:val="18"/>
               </w:rPr>
-              <w:t>About 6,200 restaurants; strong brand loyalty; scale in purchasing</w:t>
+              <w:t>6,209 restaurants worldwide, mostly in Canada; 20 straight quarters of positive same-store sales; strong purchasing power</w:t>
             </w:r>
           </w:p>
         </w:tc>
         <w:tc>
           <w:tcPr>
-            <w:tcW w:type="dxa" w:w="2304"/>
+            <w:tcW w:type="dxa" w:w="2520"/>
           </w:tcPr>
           <w:p>
             <w:pPr>
-              <w:spacing w:after="0"/>
+              <w:spacing w:after="0" w:line="240" w:lineRule="auto"/>
             </w:pPr>
             <w:r/>
             <w:r>
               <w:rPr>
-                <w:b w:val="0"/>
                 <w:sz w:val="18"/>
               </w:rPr>
               <w:t>Canadian same-store sales growth slowed from 3.6% to almost zero by Q2 2026</w:t>
@@ -318,19 +641,18 @@
         </w:tc>
         <w:tc>
           <w:tcPr>
-            <w:tcW w:type="dxa" w:w="2952"/>
+            <w:tcW w:type="dxa" w:w="3096"/>
           </w:tcPr>
           <w:p>
             <w:pPr>
-              <w:spacing w:after="0"/>
+              <w:spacing w:after="0" w:line="240" w:lineRule="auto"/>
             </w:pPr>
             <w:r/>
             <w:r>
               <w:rPr>
-                <w:b w:val="0"/>
                 <w:sz w:val="18"/>
               </w:rPr>
-              <w:t>“Back-to-basics” menu upgrades (espresso, muffins, fountain drinks); loyalty tie-up with Canadian Tire; cutting reliance on TFWs (RBI, 2026; Retail Insider, 2026)</w:t>
+              <w:t>“Back-to-basics” menu upgrades (espresso, muffins, fountain drinks); new stores; loyalty partnership with Canadian Tire (Restaurant Brands International, 2026; Retail Insider, 2026a, 2026b)</w:t>
             </w:r>
           </w:p>
         </w:tc>
@@ -338,11 +660,12 @@
       <w:tr>
         <w:tc>
           <w:tcPr>
-            <w:tcW w:type="dxa" w:w="1800"/>
+            <w:tcW w:type="dxa" w:w="1728"/>
+            <w:shd w:val="clear" w:color="auto" w:fill="E8EEF5"/>
           </w:tcPr>
           <w:p>
             <w:pPr>
-              <w:spacing w:after="0"/>
+              <w:spacing w:after="0" w:line="240" w:lineRule="auto"/>
             </w:pPr>
             <w:r/>
             <w:r>
@@ -356,55 +679,52 @@
         </w:tc>
         <w:tc>
           <w:tcPr>
-            <w:tcW w:type="dxa" w:w="2304"/>
+            <w:tcW w:type="dxa" w:w="2664"/>
           </w:tcPr>
           <w:p>
             <w:pPr>
-              <w:spacing w:after="0"/>
+              <w:spacing w:after="0" w:line="240" w:lineRule="auto"/>
             </w:pPr>
             <w:r/>
             <w:r>
               <w:rPr>
-                <w:b w:val="0"/>
                 <w:sz w:val="18"/>
               </w:rPr>
-              <w:t>Canadian-owned; clear positioning on ingredients and “made in Canada”</w:t>
+              <w:t>More than 1,000 Canadian locations; Canadian-owned and separate from the U.S. chain; ingredient-led brand</w:t>
             </w:r>
           </w:p>
         </w:tc>
         <w:tc>
           <w:tcPr>
-            <w:tcW w:type="dxa" w:w="2304"/>
+            <w:tcW w:type="dxa" w:w="2520"/>
           </w:tcPr>
           <w:p>
             <w:pPr>
-              <w:spacing w:after="0"/>
+              <w:spacing w:after="0" w:line="240" w:lineRule="auto"/>
             </w:pPr>
             <w:r/>
             <w:r>
               <w:rPr>
-                <w:b w:val="0"/>
                 <w:sz w:val="18"/>
               </w:rPr>
-              <w:t>Franchisees in Quebec warn TFW limits could force shorter hours or closures</w:t>
+              <w:t>Smaller scale and marketing budget than McDonald’s; exposed to the same labour constraints as other quick-service chains</w:t>
             </w:r>
           </w:p>
         </w:tc>
         <w:tc>
           <w:tcPr>
-            <w:tcW w:type="dxa" w:w="2952"/>
+            <w:tcW w:type="dxa" w:w="3096"/>
           </w:tcPr>
           <w:p>
             <w:pPr>
-              <w:spacing w:after="0"/>
+              <w:spacing w:after="0" w:line="240" w:lineRule="auto"/>
             </w:pPr>
             <w:r/>
             <w:r>
               <w:rPr>
-                <w:b w:val="0"/>
                 <w:sz w:val="18"/>
               </w:rPr>
-              <w:t>Leaned into Buy Canadian sentiment during the tariff dispute</w:t>
+              <w:t>Displayed “Canadian owned and managed” signage during the trade war and gained goodwill on social media (NOW Toronto, 2025)</w:t>
             </w:r>
           </w:p>
         </w:tc>
@@ -412,11 +732,12 @@
       <w:tr>
         <w:tc>
           <w:tcPr>
-            <w:tcW w:type="dxa" w:w="1800"/>
+            <w:tcW w:type="dxa" w:w="1728"/>
+            <w:shd w:val="clear" w:color="auto" w:fill="E8EEF5"/>
           </w:tcPr>
           <w:p>
             <w:pPr>
-              <w:spacing w:after="0"/>
+              <w:spacing w:after="0" w:line="240" w:lineRule="auto"/>
             </w:pPr>
             <w:r/>
             <w:r>
@@ -430,55 +751,52 @@
         </w:tc>
         <w:tc>
           <w:tcPr>
-            <w:tcW w:type="dxa" w:w="2304"/>
+            <w:tcW w:type="dxa" w:w="2664"/>
           </w:tcPr>
           <w:p>
             <w:pPr>
-              <w:spacing w:after="0"/>
+              <w:spacing w:after="0" w:line="240" w:lineRule="auto"/>
             </w:pPr>
             <w:r/>
             <w:r>
               <w:rPr>
-                <w:b w:val="0"/>
                 <w:sz w:val="18"/>
               </w:rPr>
-              <w:t>Broad portfolio (Swiss Chalet, Harvey’s, The Keg, etc.) across price points</w:t>
+              <w:t>Large multi-brand portfolio (Swiss Chalet, Harvey’s, The Keg) across price points</w:t>
             </w:r>
           </w:p>
         </w:tc>
         <w:tc>
           <w:tcPr>
-            <w:tcW w:type="dxa" w:w="2304"/>
+            <w:tcW w:type="dxa" w:w="2520"/>
           </w:tcPr>
           <w:p>
             <w:pPr>
-              <w:spacing w:after="0"/>
+              <w:spacing w:after="0" w:line="240" w:lineRule="auto"/>
             </w:pPr>
             <w:r/>
             <w:r>
               <w:rPr>
-                <w:b w:val="0"/>
                 <w:sz w:val="18"/>
               </w:rPr>
-              <w:t>Casual dining is the segment most hurt by squeezed household budgets</w:t>
+              <w:t>Heavy exposure to casual dining, the segment hit hardest by tight household budgets</w:t>
             </w:r>
           </w:p>
         </w:tc>
         <w:tc>
           <w:tcPr>
-            <w:tcW w:type="dxa" w:w="2952"/>
+            <w:tcW w:type="dxa" w:w="3096"/>
           </w:tcPr>
           <w:p>
             <w:pPr>
-              <w:spacing w:after="0"/>
+              <w:spacing w:after="0" w:line="240" w:lineRule="auto"/>
             </w:pPr>
             <w:r/>
             <w:r>
               <w:rPr>
-                <w:b w:val="0"/>
                 <w:sz w:val="18"/>
               </w:rPr>
-              <w:t>Private ownership since 2022 lets it restructure without quarterly market pressure</w:t>
+              <w:t>Private ownership since 2022 allows restructuring without quarterly market pressure</w:t>
             </w:r>
           </w:p>
         </w:tc>
@@ -486,11 +804,12 @@
       <w:tr>
         <w:tc>
           <w:tcPr>
-            <w:tcW w:type="dxa" w:w="1800"/>
+            <w:tcW w:type="dxa" w:w="1728"/>
+            <w:shd w:val="clear" w:color="auto" w:fill="E8EEF5"/>
           </w:tcPr>
           <w:p>
             <w:pPr>
-              <w:spacing w:after="0"/>
+              <w:spacing w:after="0" w:line="240" w:lineRule="auto"/>
             </w:pPr>
             <w:r/>
             <w:r>
@@ -498,61 +817,58 @@
                 <w:b/>
                 <w:sz w:val="18"/>
               </w:rPr>
-              <w:t>Marriott, Hilton, IHG, Accor (Fairmont)</w:t>
+              <w:t>Marriott, Hilton and Choice Hotels</w:t>
             </w:r>
           </w:p>
         </w:tc>
         <w:tc>
           <w:tcPr>
-            <w:tcW w:type="dxa" w:w="2304"/>
+            <w:tcW w:type="dxa" w:w="2664"/>
           </w:tcPr>
           <w:p>
             <w:pPr>
-              <w:spacing w:after="0"/>
+              <w:spacing w:after="0" w:line="240" w:lineRule="auto"/>
             </w:pPr>
             <w:r/>
             <w:r>
               <w:rPr>
-                <w:b w:val="0"/>
                 <w:sz w:val="18"/>
               </w:rPr>
-              <w:t>Huge loyalty programs, global booking engines, strong brand trust</w:t>
+              <w:t>Marriott has 300+ Canadian hotels and Hilton 200+; large loyalty programs and booking engines</w:t>
             </w:r>
           </w:p>
         </w:tc>
         <w:tc>
           <w:tcPr>
-            <w:tcW w:type="dxa" w:w="2304"/>
+            <w:tcW w:type="dxa" w:w="2520"/>
           </w:tcPr>
           <w:p>
             <w:pPr>
-              <w:spacing w:after="0"/>
+              <w:spacing w:after="0" w:line="240" w:lineRule="auto"/>
             </w:pPr>
             <w:r/>
             <w:r>
               <w:rPr>
-                <w:b w:val="0"/>
                 <w:sz w:val="18"/>
               </w:rPr>
-              <w:t>Exposed to softer U.S. inbound demand; high franchise fees for owners</w:t>
+              <w:t>Rely on rate growth; summer 2026 occupancy softened; owners pay high franchise fees</w:t>
             </w:r>
           </w:p>
         </w:tc>
         <w:tc>
           <w:tcPr>
-            <w:tcW w:type="dxa" w:w="2952"/>
+            <w:tcW w:type="dxa" w:w="3096"/>
           </w:tcPr>
           <w:p>
             <w:pPr>
-              <w:spacing w:after="0"/>
+              <w:spacing w:after="0" w:line="240" w:lineRule="auto"/>
             </w:pPr>
             <w:r/>
             <w:r>
               <w:rPr>
-                <w:b w:val="0"/>
                 <w:sz w:val="18"/>
               </w:rPr>
-              <w:t>Expanding midscale and extended-stay brands; growth driven mainly by rate</w:t>
+              <w:t>Marriott is adding about 11 hotels and Hilton about 15 in 2026, including midscale Spark by Hilton. Choice is opening six Ascend Collection hotels in Quebec (Rewards Canada, 2026; RENX, 2026; Hotel Investment Today, n.d.)</w:t>
             </w:r>
           </w:p>
         </w:tc>
@@ -560,11 +876,12 @@
       <w:tr>
         <w:tc>
           <w:tcPr>
-            <w:tcW w:type="dxa" w:w="1800"/>
+            <w:tcW w:type="dxa" w:w="1728"/>
+            <w:shd w:val="clear" w:color="auto" w:fill="E8EEF5"/>
           </w:tcPr>
           <w:p>
             <w:pPr>
-              <w:spacing w:after="0"/>
+              <w:spacing w:after="0" w:line="240" w:lineRule="auto"/>
             </w:pPr>
             <w:r/>
             <w:r>
@@ -572,61 +889,130 @@
                 <w:b/>
                 <w:sz w:val="18"/>
               </w:rPr>
-              <w:t>Airbnb &amp; Uber Eats / DoorDash</w:t>
+              <w:t>Independent restaurants and hotels</w:t>
             </w:r>
           </w:p>
         </w:tc>
         <w:tc>
           <w:tcPr>
-            <w:tcW w:type="dxa" w:w="2304"/>
+            <w:tcW w:type="dxa" w:w="2664"/>
           </w:tcPr>
           <w:p>
             <w:pPr>
-              <w:spacing w:after="0"/>
+              <w:spacing w:after="0" w:line="240" w:lineRule="auto"/>
             </w:pPr>
             <w:r/>
             <w:r>
               <w:rPr>
-                <w:b w:val="0"/>
                 <w:sz w:val="18"/>
               </w:rPr>
-              <w:t>Convenience and huge reach; own the customer relationship</w:t>
+              <w:t>Local identity, flexibility and authentic stories that perform well on social media</w:t>
             </w:r>
           </w:p>
         </w:tc>
         <w:tc>
           <w:tcPr>
-            <w:tcW w:type="dxa" w:w="2304"/>
+            <w:tcW w:type="dxa" w:w="2520"/>
           </w:tcPr>
           <w:p>
             <w:pPr>
-              <w:spacing w:after="0"/>
+              <w:spacing w:after="0" w:line="240" w:lineRule="auto"/>
             </w:pPr>
             <w:r/>
             <w:r>
               <w:rPr>
-                <w:b w:val="0"/>
                 <w:sz w:val="18"/>
               </w:rPr>
-              <w:t>Tighter short-term rental rules; restaurants resent 20–30% delivery commissions</w:t>
+              <w:t>Thin margins, little purchasing power and smaller technology budgets</w:t>
             </w:r>
           </w:p>
         </w:tc>
         <w:tc>
           <w:tcPr>
-            <w:tcW w:type="dxa" w:w="2952"/>
+            <w:tcW w:type="dxa" w:w="3096"/>
           </w:tcPr>
           <w:p>
             <w:pPr>
-              <w:spacing w:after="0"/>
+              <w:spacing w:after="0" w:line="240" w:lineRule="auto"/>
             </w:pPr>
             <w:r/>
             <w:r>
               <w:rPr>
-                <w:b w:val="0"/>
                 <w:sz w:val="18"/>
               </w:rPr>
-              <w:t>Platforms keep adding ads and membership tiers that pull margin away from operators</w:t>
+              <w:t>Adopting POS analytics and AI tools to offset labour shortages (TouchBistro, 2026)</w:t>
+            </w:r>
+          </w:p>
+        </w:tc>
+      </w:tr>
+      <w:tr>
+        <w:tc>
+          <w:tcPr>
+            <w:tcW w:type="dxa" w:w="1728"/>
+            <w:shd w:val="clear" w:color="auto" w:fill="E8EEF5"/>
+          </w:tcPr>
+          <w:p>
+            <w:pPr>
+              <w:spacing w:after="0" w:line="240" w:lineRule="auto"/>
+            </w:pPr>
+            <w:r/>
+            <w:r>
+              <w:rPr>
+                <w:b/>
+                <w:sz w:val="18"/>
+              </w:rPr>
+              <w:t>Platforms and substitutes</w:t>
+            </w:r>
+          </w:p>
+        </w:tc>
+        <w:tc>
+          <w:tcPr>
+            <w:tcW w:type="dxa" w:w="2664"/>
+          </w:tcPr>
+          <w:p>
+            <w:pPr>
+              <w:spacing w:after="0" w:line="240" w:lineRule="auto"/>
+            </w:pPr>
+            <w:r/>
+            <w:r>
+              <w:rPr>
+                <w:sz w:val="18"/>
+              </w:rPr>
+              <w:t>Airbnb, Uber Eats and DoorDash offer convenience and reach, and they own the customer relationship</w:t>
+            </w:r>
+          </w:p>
+        </w:tc>
+        <w:tc>
+          <w:tcPr>
+            <w:tcW w:type="dxa" w:w="2520"/>
+          </w:tcPr>
+          <w:p>
+            <w:pPr>
+              <w:spacing w:after="0" w:line="240" w:lineRule="auto"/>
+            </w:pPr>
+            <w:r/>
+            <w:r>
+              <w:rPr>
+                <w:sz w:val="18"/>
+              </w:rPr>
+              <w:t>Short-term rental limits (e.g., B.C.’s principal-residence rule) shrink Airbnb supply; restaurants resent high delivery commissions</w:t>
+            </w:r>
+          </w:p>
+        </w:tc>
+        <w:tc>
+          <w:tcPr>
+            <w:tcW w:type="dxa" w:w="3096"/>
+          </w:tcPr>
+          <w:p>
+            <w:pPr>
+              <w:spacing w:after="0" w:line="240" w:lineRule="auto"/>
+            </w:pPr>
+            <w:r/>
+            <w:r>
+              <w:rPr>
+                <w:sz w:val="18"/>
+              </w:rPr>
+              <w:t>Platforms keep adding paid memberships and advertising, which shifts margin away from operators</w:t>
             </w:r>
           </w:p>
         </w:tc>
@@ -634,18 +1020,19 @@
     </w:tbl>
     <w:p>
       <w:pPr>
-        <w:spacing w:after="100" w:before="100"/>
+        <w:spacing w:before="80"/>
       </w:pPr>
       <w:r>
         <w:rPr>
           <w:i w:val="0"/>
         </w:rPr>
-        <w:t>The pattern is clear. Large chains are protecting their market share with value pricing, loyalty and better data. Independents, on the other hand, are getting squeezed between rising costs and the commissions they pay platforms.</w:t>
+        <w:t>The competitive takeaway is that chains defend their share through scale, loyalty programs and data, while independents compete on local identity and authenticity. Hotel supply is still growing even as occupancy softens, so pricing power will weaken unless demand keeps pace.</w:t>
       </w:r>
     </w:p>
     <w:p>
       <w:pPr>
-        <w:spacing w:before="160" w:after="60"/>
+        <w:keepNext/>
+        <w:spacing w:before="140" w:after="60"/>
       </w:pPr>
       <w:r>
         <w:rPr>
@@ -653,28 +1040,28 @@
           <w:color w:val="1F3A5F"/>
           <w:sz w:val="25"/>
         </w:rPr>
-        <w:t>4. Market Changes, Trends and Opportunities</w:t>
+        <w:t>4. Market Changes, Emerging Trends and Opportunities</w:t>
       </w:r>
     </w:p>
     <w:p>
       <w:pPr>
         <w:pStyle w:val="ListBullet"/>
-        <w:spacing w:after="60"/>
+        <w:spacing w:after="40"/>
       </w:pPr>
       <w:r>
         <w:rPr>
           <w:b/>
         </w:rPr>
-        <w:t xml:space="preserve">Domestic travel has gained ground. </w:t>
+        <w:t xml:space="preserve">Travel spending has shifted toward Canada. </w:t>
       </w:r>
       <w:r>
-        <w:t>With fewer Canadians heading south, more vacation money is being spent at home: road trips, staycations and visits to national parks. Hotels outside the big cities and restaurants in tourist areas are in a good position to capture it.</w:t>
+        <w:t>Far fewer Canadians are driving south, and Restaurants Canada credits this redirected spending with part of the strength in 2025 sales. Opportunity: regional getaway packages, partnerships with national parks, and marketing aimed at Canadian travellers, especially outside Toronto and Vancouver.</w:t>
       </w:r>
     </w:p>
     <w:p>
       <w:pPr>
         <w:pStyle w:val="ListBullet"/>
-        <w:spacing w:after="60"/>
+        <w:spacing w:after="40"/>
       </w:pPr>
       <w:r>
         <w:rPr>
@@ -683,43 +1070,43 @@
         <w:t xml:space="preserve">Big events help, but less than expected. </w:t>
       </w:r>
       <w:r>
-        <w:t>The 2026 FIFA World Cup in Toronto and Vancouver showed this. Hotel occupancy actually dipped in both cities, though higher rates made up for part of it. Restaurants did better, with card spending up 12% and spending by international visitors up 57% (CBC News, 2026; CoStar, 2026c). Planning based on hype is risky. Planning based on data is not.</w:t>
+        <w:t>During the 2026 FIFA World Cup, hotel occupancy actually dipped in Toronto and Vancouver, though higher rates offset part of the loss. Restaurants did better: card spending rose 12% and international visitors spent 57% more (CBC News, 2026; CoStar, 2026c). Opportunity: base event plans on data, not hype.</w:t>
       </w:r>
     </w:p>
     <w:p>
       <w:pPr>
         <w:pStyle w:val="ListBullet"/>
-        <w:spacing w:after="60"/>
+        <w:spacing w:after="40"/>
       </w:pPr>
       <w:r>
         <w:rPr>
           <w:b/>
         </w:rPr>
-        <w:t xml:space="preserve">Value is back. </w:t>
+        <w:t xml:space="preserve">Consumers want value and transparency. </w:t>
       </w:r>
       <w:r>
-        <w:t>On TikTok and Instagram, “budget eats” and “worth it or not” reviews draw large audiences. Customers will still spend, but they want to feel the price is fair, with no surprise fees and no guilt-trip tip screens.</w:t>
+        <w:t>TikTok “budget eats” and “is it worth it?” reviews draw large audiences, and tipping fatigue is widespread. Guests still spend, but only where the price feels fair. Opportunity: fixed-price menus, bundled hotel packages, and service-included pricing pilots.</w:t>
       </w:r>
     </w:p>
     <w:p>
       <w:pPr>
         <w:pStyle w:val="ListBullet"/>
-        <w:spacing w:after="60"/>
+        <w:spacing w:after="40"/>
       </w:pPr>
       <w:r>
         <w:rPr>
           <w:b/>
         </w:rPr>
-        <w:t xml:space="preserve">Labour scarcity is driving automation. </w:t>
+        <w:t xml:space="preserve">Labour scarcity is speeding up automation. </w:t>
       </w:r>
       <w:r>
-        <w:t>Hotels Canada reports that 46% of hotels lost TFWs to expiring permits in early 2026 and 58% expect shortages in the year ahead (Hotelier Magazine, 2026). That is pushing operators toward kiosks, mobile check-in and smarter scheduling.</w:t>
+        <w:t>In early 2026, 46% of hotels lost temporary foreign workers to expiring permits, and 58% expect shortages over the next year (Hotelier Magazine, 2026). Opportunity: kiosks, mobile check-in and AI-assisted scheduling that let smaller teams deliver the same service.</w:t>
       </w:r>
     </w:p>
     <w:p>
       <w:pPr>
         <w:pStyle w:val="ListBullet"/>
-        <w:spacing w:after="60"/>
+        <w:spacing w:after="40"/>
       </w:pPr>
       <w:r>
         <w:rPr>
@@ -728,12 +1115,13 @@
         <w:t xml:space="preserve">Unstructured data is underused. </w:t>
       </w:r>
       <w:r>
-        <w:t>Google, TripAdvisor and Reddit reviews contain honest feedback on service, cleanliness and pricing. Most independent operators read reviews one at a time when they could be analyzing them in bulk.</w:t>
+        <w:t>Reviews on Google, TripAdvisor and Reddit give honest feedback on service, cleanliness and value, yet most operators read them one by one. Opportunity: sentiment analysis that turns thousands of comments into measurable service priorities.</w:t>
       </w:r>
     </w:p>
     <w:p>
       <w:pPr>
-        <w:spacing w:before="160" w:after="60"/>
+        <w:keepNext/>
+        <w:spacing w:before="140" w:after="60"/>
       </w:pPr>
       <w:r>
         <w:rPr>
@@ -752,98 +1140,454 @@
         <w:rPr>
           <w:i w:val="0"/>
         </w:rPr>
-        <w:t>Based on this scan, I would recommend that hospitality businesses in Canada focus on five practical moves:</w:t>
+        <w:t>Each recommendation in Table 3 responds directly to a challenge identified above and comes with a business intelligence tool or KPI to track results.</w:t>
       </w:r>
     </w:p>
+    <w:tbl>
+      <w:tblPr>
+        <w:tblStyle w:val="TableGrid"/>
+        <w:tblW w:type="auto" w:w="0"/>
+        <w:tblLayout w:type="fixed"/>
+        <w:tblLook w:firstColumn="1" w:firstRow="1" w:lastColumn="0" w:lastRow="0" w:noHBand="0" w:noVBand="1" w:val="04A0"/>
+      </w:tblPr>
+      <w:tblGrid>
+        <w:gridCol w:w="1872"/>
+        <w:gridCol w:w="5112"/>
+        <w:gridCol w:w="3024"/>
+      </w:tblGrid>
+      <w:tr>
+        <w:trPr>
+          <w:tblHeader w:val="true"/>
+        </w:trPr>
+        <w:tc>
+          <w:tcPr>
+            <w:tcW w:type="dxa" w:w="1872"/>
+            <w:shd w:val="clear" w:color="auto" w:fill="1F3A5F"/>
+          </w:tcPr>
+          <w:p>
+            <w:pPr>
+              <w:spacing w:after="0" w:line="240" w:lineRule="auto"/>
+            </w:pPr>
+            <w:r/>
+            <w:r>
+              <w:rPr>
+                <w:b/>
+                <w:color w:val="FFFFFF"/>
+                <w:sz w:val="18"/>
+              </w:rPr>
+              <w:t>Challenge</w:t>
+            </w:r>
+          </w:p>
+        </w:tc>
+        <w:tc>
+          <w:tcPr>
+            <w:tcW w:type="dxa" w:w="5112"/>
+            <w:shd w:val="clear" w:color="auto" w:fill="1F3A5F"/>
+          </w:tcPr>
+          <w:p>
+            <w:pPr>
+              <w:spacing w:after="0" w:line="240" w:lineRule="auto"/>
+            </w:pPr>
+            <w:r/>
+            <w:r>
+              <w:rPr>
+                <w:b/>
+                <w:color w:val="FFFFFF"/>
+                <w:sz w:val="18"/>
+              </w:rPr>
+              <w:t>Recommended action</w:t>
+            </w:r>
+          </w:p>
+        </w:tc>
+        <w:tc>
+          <w:tcPr>
+            <w:tcW w:type="dxa" w:w="3024"/>
+            <w:shd w:val="clear" w:color="auto" w:fill="1F3A5F"/>
+          </w:tcPr>
+          <w:p>
+            <w:pPr>
+              <w:spacing w:after="0" w:line="240" w:lineRule="auto"/>
+            </w:pPr>
+            <w:r/>
+            <w:r>
+              <w:rPr>
+                <w:b/>
+                <w:color w:val="FFFFFF"/>
+                <w:sz w:val="18"/>
+              </w:rPr>
+              <w:t>BI tool / KPI</w:t>
+            </w:r>
+          </w:p>
+        </w:tc>
+      </w:tr>
+      <w:tr>
+        <w:tc>
+          <w:tcPr>
+            <w:tcW w:type="dxa" w:w="1872"/>
+            <w:shd w:val="clear" w:color="auto" w:fill="E8EEF5"/>
+          </w:tcPr>
+          <w:p>
+            <w:pPr>
+              <w:spacing w:after="0" w:line="240" w:lineRule="auto"/>
+            </w:pPr>
+            <w:r/>
+            <w:r>
+              <w:rPr>
+                <w:b/>
+                <w:sz w:val="18"/>
+              </w:rPr>
+              <w:t>Margin squeeze</w:t>
+            </w:r>
+          </w:p>
+        </w:tc>
+        <w:tc>
+          <w:tcPr>
+            <w:tcW w:type="dxa" w:w="5112"/>
+          </w:tcPr>
+          <w:p>
+            <w:pPr>
+              <w:spacing w:after="0" w:line="240" w:lineRule="auto"/>
+            </w:pPr>
+            <w:r/>
+            <w:r>
+              <w:rPr>
+                <w:sz w:val="18"/>
+              </w:rPr>
+              <w:t>Restaurants: use menu engineering to cut or reprice low-margin items, and renegotiate supplier contracts. Hotels: grow ancillary revenue (parking, food and beverage, early check-in) instead of relying on room rate alone.</w:t>
+            </w:r>
+          </w:p>
+        </w:tc>
+        <w:tc>
+          <w:tcPr>
+            <w:tcW w:type="dxa" w:w="3024"/>
+          </w:tcPr>
+          <w:p>
+            <w:pPr>
+              <w:spacing w:after="0" w:line="240" w:lineRule="auto"/>
+            </w:pPr>
+            <w:r/>
+            <w:r>
+              <w:rPr>
+                <w:sz w:val="18"/>
+              </w:rPr>
+              <w:t>Weekly cost dashboard; prime cost (food + labour) at 60–65% of sales; GOPPAR</w:t>
+            </w:r>
+          </w:p>
+        </w:tc>
+      </w:tr>
+      <w:tr>
+        <w:tc>
+          <w:tcPr>
+            <w:tcW w:type="dxa" w:w="1872"/>
+            <w:shd w:val="clear" w:color="auto" w:fill="E8EEF5"/>
+          </w:tcPr>
+          <w:p>
+            <w:pPr>
+              <w:spacing w:after="0" w:line="240" w:lineRule="auto"/>
+            </w:pPr>
+            <w:r/>
+            <w:r>
+              <w:rPr>
+                <w:b/>
+                <w:sz w:val="18"/>
+              </w:rPr>
+              <w:t>Labour shortages and rising wages</w:t>
+            </w:r>
+          </w:p>
+        </w:tc>
+        <w:tc>
+          <w:tcPr>
+            <w:tcW w:type="dxa" w:w="5112"/>
+          </w:tcPr>
+          <w:p>
+            <w:pPr>
+              <w:spacing w:after="0" w:line="240" w:lineRule="auto"/>
+            </w:pPr>
+            <w:r/>
+            <w:r>
+              <w:rPr>
+                <w:sz w:val="18"/>
+              </w:rPr>
+              <w:t>Schedule staff based on demand forecasts from POS and booking history. Cross-train employees, and invest in retention (staff housing in resort towns, clear career paths) instead of relying on temporary foreign workers.</w:t>
+            </w:r>
+          </w:p>
+        </w:tc>
+        <w:tc>
+          <w:tcPr>
+            <w:tcW w:type="dxa" w:w="3024"/>
+          </w:tcPr>
+          <w:p>
+            <w:pPr>
+              <w:spacing w:after="0" w:line="240" w:lineRule="auto"/>
+            </w:pPr>
+            <w:r/>
+            <w:r>
+              <w:rPr>
+                <w:sz w:val="18"/>
+              </w:rPr>
+              <w:t>Sales per labour hour; staff turnover rate</w:t>
+            </w:r>
+          </w:p>
+        </w:tc>
+      </w:tr>
+      <w:tr>
+        <w:tc>
+          <w:tcPr>
+            <w:tcW w:type="dxa" w:w="1872"/>
+            <w:shd w:val="clear" w:color="auto" w:fill="E8EEF5"/>
+          </w:tcPr>
+          <w:p>
+            <w:pPr>
+              <w:spacing w:after="0" w:line="240" w:lineRule="auto"/>
+            </w:pPr>
+            <w:r/>
+            <w:r>
+              <w:rPr>
+                <w:b/>
+                <w:sz w:val="18"/>
+              </w:rPr>
+              <w:t>Value-sensitive, fee-averse guests</w:t>
+            </w:r>
+          </w:p>
+        </w:tc>
+        <w:tc>
+          <w:tcPr>
+            <w:tcW w:type="dxa" w:w="5112"/>
+          </w:tcPr>
+          <w:p>
+            <w:pPr>
+              <w:spacing w:after="0" w:line="240" w:lineRule="auto"/>
+            </w:pPr>
+            <w:r/>
+            <w:r>
+              <w:rPr>
+                <w:sz w:val="18"/>
+              </w:rPr>
+              <w:t>Advertise all-in prices, offer prix fixe menus and bundled stays, and test lower default tip prompts or service-included pricing.</w:t>
+            </w:r>
+          </w:p>
+        </w:tc>
+        <w:tc>
+          <w:tcPr>
+            <w:tcW w:type="dxa" w:w="3024"/>
+          </w:tcPr>
+          <w:p>
+            <w:pPr>
+              <w:spacing w:after="0" w:line="240" w:lineRule="auto"/>
+            </w:pPr>
+            <w:r/>
+            <w:r>
+              <w:rPr>
+                <w:sz w:val="18"/>
+              </w:rPr>
+              <w:t>Average cheque; visit frequency; review sentiment on “price”</w:t>
+            </w:r>
+          </w:p>
+        </w:tc>
+      </w:tr>
+      <w:tr>
+        <w:tc>
+          <w:tcPr>
+            <w:tcW w:type="dxa" w:w="1872"/>
+            <w:shd w:val="clear" w:color="auto" w:fill="E8EEF5"/>
+          </w:tcPr>
+          <w:p>
+            <w:pPr>
+              <w:spacing w:after="0" w:line="240" w:lineRule="auto"/>
+            </w:pPr>
+            <w:r/>
+            <w:r>
+              <w:rPr>
+                <w:b/>
+                <w:sz w:val="18"/>
+              </w:rPr>
+              <w:t>Shift to domestic travel and Buy Canadian</w:t>
+            </w:r>
+          </w:p>
+        </w:tc>
+        <w:tc>
+          <w:tcPr>
+            <w:tcW w:type="dxa" w:w="5112"/>
+          </w:tcPr>
+          <w:p>
+            <w:pPr>
+              <w:spacing w:after="0" w:line="240" w:lineRule="auto"/>
+            </w:pPr>
+            <w:r/>
+            <w:r>
+              <w:rPr>
+                <w:sz w:val="18"/>
+              </w:rPr>
+              <w:t>Build packages for Canadian travellers with local tourism boards, and promote Canadian suppliers on menus and in hotel amenities.</w:t>
+            </w:r>
+          </w:p>
+        </w:tc>
+        <w:tc>
+          <w:tcPr>
+            <w:tcW w:type="dxa" w:w="3024"/>
+          </w:tcPr>
+          <w:p>
+            <w:pPr>
+              <w:spacing w:after="0" w:line="240" w:lineRule="auto"/>
+            </w:pPr>
+            <w:r/>
+            <w:r>
+              <w:rPr>
+                <w:sz w:val="18"/>
+              </w:rPr>
+              <w:t>Share of domestic bookings; package uptake</w:t>
+            </w:r>
+          </w:p>
+        </w:tc>
+      </w:tr>
+      <w:tr>
+        <w:tc>
+          <w:tcPr>
+            <w:tcW w:type="dxa" w:w="1872"/>
+            <w:shd w:val="clear" w:color="auto" w:fill="E8EEF5"/>
+          </w:tcPr>
+          <w:p>
+            <w:pPr>
+              <w:spacing w:after="0" w:line="240" w:lineRule="auto"/>
+            </w:pPr>
+            <w:r/>
+            <w:r>
+              <w:rPr>
+                <w:b/>
+                <w:sz w:val="18"/>
+              </w:rPr>
+              <w:t>Data that goes unused</w:t>
+            </w:r>
+          </w:p>
+        </w:tc>
+        <w:tc>
+          <w:tcPr>
+            <w:tcW w:type="dxa" w:w="5112"/>
+          </w:tcPr>
+          <w:p>
+            <w:pPr>
+              <w:spacing w:after="0" w:line="240" w:lineRule="auto"/>
+            </w:pPr>
+            <w:r/>
+            <w:r>
+              <w:rPr>
+                <w:sz w:val="18"/>
+              </w:rPr>
+              <w:t>Combine PMS, POS, reservation and loyalty data in a data warehouse to create a single view of each guest. Collect consent in line with PIPEDA and Quebec’s Law 25.</w:t>
+            </w:r>
+          </w:p>
+        </w:tc>
+        <w:tc>
+          <w:tcPr>
+            <w:tcW w:type="dxa" w:w="3024"/>
+          </w:tcPr>
+          <w:p>
+            <w:pPr>
+              <w:spacing w:after="0" w:line="240" w:lineRule="auto"/>
+            </w:pPr>
+            <w:r/>
+            <w:r>
+              <w:rPr>
+                <w:sz w:val="18"/>
+              </w:rPr>
+              <w:t>Repeat-guest rate; guest lifetime value; sentiment score</w:t>
+            </w:r>
+          </w:p>
+        </w:tc>
+      </w:tr>
+      <w:tr>
+        <w:tc>
+          <w:tcPr>
+            <w:tcW w:type="dxa" w:w="1872"/>
+            <w:shd w:val="clear" w:color="auto" w:fill="E8EEF5"/>
+          </w:tcPr>
+          <w:p>
+            <w:pPr>
+              <w:spacing w:after="0" w:line="240" w:lineRule="auto"/>
+            </w:pPr>
+            <w:r/>
+            <w:r>
+              <w:rPr>
+                <w:b/>
+                <w:sz w:val="18"/>
+              </w:rPr>
+              <w:t>Climate and event volatility</w:t>
+            </w:r>
+          </w:p>
+        </w:tc>
+        <w:tc>
+          <w:tcPr>
+            <w:tcW w:type="dxa" w:w="5112"/>
+          </w:tcPr>
+          <w:p>
+            <w:pPr>
+              <w:spacing w:after="0" w:line="240" w:lineRule="auto"/>
+            </w:pPr>
+            <w:r/>
+            <w:r>
+              <w:rPr>
+                <w:sz w:val="18"/>
+              </w:rPr>
+              <w:t>Build demand forecasts that include event calendars and weather. Plan scenarios for wildfire season and offer flexible cancellation policies.</w:t>
+            </w:r>
+          </w:p>
+        </w:tc>
+        <w:tc>
+          <w:tcPr>
+            <w:tcW w:type="dxa" w:w="3024"/>
+          </w:tcPr>
+          <w:p>
+            <w:pPr>
+              <w:spacing w:after="0" w:line="240" w:lineRule="auto"/>
+            </w:pPr>
+            <w:r/>
+            <w:r>
+              <w:rPr>
+                <w:sz w:val="18"/>
+              </w:rPr>
+              <w:t>Forecast accuracy; revenue lost to closures</w:t>
+            </w:r>
+          </w:p>
+        </w:tc>
+      </w:tr>
+    </w:tbl>
     <w:p>
       <w:pPr>
-        <w:pStyle w:val="ListBullet"/>
-        <w:spacing w:after="60"/>
-      </w:pPr>
-      <w:r>
-        <w:rPr>
-          <w:b/>
-        </w:rPr>
-        <w:t xml:space="preserve">Build one view of the customer. </w:t>
-      </w:r>
-      <w:r>
-        <w:t>Hotels should connect their property management, booking and loyalty systems. Restaurants should do the same with POS, online ordering and reservation data. Put it all in a simple data warehouse so managers can see who their guests are, how often they come back and what they spend.</w:t>
-      </w:r>
-    </w:p>
-    <w:p>
-      <w:pPr>
-        <w:pStyle w:val="ListBullet"/>
-        <w:spacing w:after="60"/>
-      </w:pPr>
-      <w:r>
-        <w:rPr>
-          <w:b/>
-        </w:rPr>
-        <w:t xml:space="preserve">Use dashboards to protect margin, not just track sales. </w:t>
-      </w:r>
-      <w:r>
-        <w:t>A weekly dashboard showing food cost %, labour cost %, RevPAR and covers per labour hour helps managers catch problems early. Revenue is already rising on price alone. Cost discipline is what decides whether operators stay profitable.</w:t>
-      </w:r>
-    </w:p>
-    <w:p>
-      <w:pPr>
-        <w:pStyle w:val="ListBullet"/>
-        <w:spacing w:after="60"/>
-      </w:pPr>
-      <w:r>
-        <w:rPr>
-          <w:b/>
-        </w:rPr>
-        <w:t xml:space="preserve">Mine reviews and social media. </w:t>
-      </w:r>
-      <w:r>
-        <w:t>Simple sentiment analysis on reviews and social posts can show recurring complaints (slow service, fees, cleanliness) and turn them into fixes that can be measured.</w:t>
-      </w:r>
-    </w:p>
-    <w:p>
-      <w:pPr>
-        <w:pStyle w:val="ListBullet"/>
-        <w:spacing w:after="60"/>
-      </w:pPr>
-      <w:r>
-        <w:rPr>
-          <w:b/>
-        </w:rPr>
-        <w:t xml:space="preserve">Compete on honest value. </w:t>
-      </w:r>
-      <w:r>
-        <w:t>Show all-in pricing, offer fixed-price menus or hotel packages, and lean into Canadian sourcing. This builds trust and keeps businesses ahead of drip-pricing rules.</w:t>
-      </w:r>
-    </w:p>
-    <w:p>
-      <w:pPr>
-        <w:pStyle w:val="ListBullet"/>
-        <w:spacing w:after="60"/>
-      </w:pPr>
-      <w:r>
-        <w:rPr>
-          <w:b/>
-        </w:rPr>
-        <w:t xml:space="preserve">Plan for fewer workers. </w:t>
-      </w:r>
-      <w:r>
-        <w:t>Cross-train staff, use demand forecasting to schedule shifts, and invest in retaining good employees (housing support in resort towns, clear career paths) rather than counting on foreign worker programs that keep getting tighter.</w:t>
-      </w:r>
-    </w:p>
-    <w:p>
-      <w:pPr>
-        <w:spacing w:after="120"/>
+        <w:spacing w:before="80"/>
       </w:pPr>
       <w:r>
         <w:rPr>
           <w:i w:val="0"/>
         </w:rPr>
-        <w:t>In short, demand for Canadian hospitality has not gone away, but the easy wins have. The operators that turn their data into faster, better decisions will be the ones that stay profitable.</w:t>
+        <w:t>Implementation can be phased. In the first three months, launch the cost dashboard and the pricing changes. From months three to twelve, build the data warehouse, forecasting and sentiment analysis.</w:t>
       </w:r>
     </w:p>
     <w:p>
       <w:pPr>
-        <w:spacing w:before="160" w:after="60"/>
+        <w:keepNext/>
+        <w:spacing w:before="140" w:after="60"/>
+      </w:pPr>
+      <w:r>
+        <w:rPr>
+          <w:b/>
+          <w:color w:val="1F3A5F"/>
+          <w:sz w:val="25"/>
+        </w:rPr>
+        <w:t>6. Conclusion</w:t>
+      </w:r>
+    </w:p>
+    <w:p>
+      <w:r>
+        <w:rPr>
+          <w:i w:val="0"/>
+        </w:rPr>
+        <w:t>Canadian hospitality is not short of demand. Domestic travel, major events and loyal local customers keep people coming through the doors. What it is short of is margin and workers. The operators that will do well are the ones that treat data as a strategic asset: tracking costs every week, listening to guests at scale, and planning around evidence instead of hype.</w:t>
+      </w:r>
+    </w:p>
+    <w:p>
+      <w:pPr>
+        <w:keepNext/>
+        <w:spacing w:before="140" w:after="60"/>
       </w:pPr>
       <w:r>
         <w:rPr>
@@ -856,132 +1600,272 @@
     </w:p>
     <w:p>
       <w:pPr>
-        <w:spacing w:after="40"/>
+        <w:spacing w:after="20" w:line="240" w:lineRule="auto"/>
         <w:ind w:left="576" w:hanging="576"/>
       </w:pPr>
       <w:r>
         <w:rPr>
-          <w:sz w:val="19"/>
+          <w:sz w:val="18"/>
+        </w:rPr>
+        <w:t>Angus Reid Institute. (2023, February 16). Tipping in Canada: How tipflation and tip creep are testing consumer patience. https://angusreid.org/canada-tipping-service-hospitality-included-tipflation-tip-creep/</w:t>
+      </w:r>
+    </w:p>
+    <w:p>
+      <w:pPr>
+        <w:spacing w:after="20" w:line="240" w:lineRule="auto"/>
+        <w:ind w:left="576" w:hanging="576"/>
+      </w:pPr>
+      <w:r>
+        <w:rPr>
+          <w:sz w:val="18"/>
         </w:rPr>
         <w:t>CBC News. (2026). Toronto saw little economic gain during World Cup’s first 2 weeks in city, data shows. https://www.cbc.ca/news/canada/toronto/economic-impact-toronto-fifa-9.7258589</w:t>
       </w:r>
     </w:p>
     <w:p>
       <w:pPr>
-        <w:spacing w:after="40"/>
+        <w:spacing w:after="20" w:line="240" w:lineRule="auto"/>
         <w:ind w:left="576" w:hanging="576"/>
       </w:pPr>
       <w:r>
         <w:rPr>
-          <w:sz w:val="19"/>
+          <w:sz w:val="18"/>
         </w:rPr>
         <w:t>CoStar. (2026a). Canada hotels post record-setting performance in 2025. https://www.costar.com/products/str-benchmark/resources/press-releases/canada-hotels-post-record-setting-performance-2025</w:t>
       </w:r>
     </w:p>
     <w:p>
       <w:pPr>
-        <w:spacing w:after="40"/>
+        <w:spacing w:after="20" w:line="240" w:lineRule="auto"/>
         <w:ind w:left="576" w:hanging="576"/>
       </w:pPr>
       <w:r>
         <w:rPr>
-          <w:sz w:val="19"/>
+          <w:sz w:val="18"/>
         </w:rPr>
         <w:t>CoStar. (2026b). Canada hotels report first monthly occupancy decline of 2026. https://www.costar.com/products/str-benchmark/resources/press-releases/canada-hotels-report-first-monthly-occupancy</w:t>
       </w:r>
     </w:p>
     <w:p>
       <w:pPr>
-        <w:spacing w:after="40"/>
+        <w:spacing w:after="20" w:line="240" w:lineRule="auto"/>
         <w:ind w:left="576" w:hanging="576"/>
       </w:pPr>
       <w:r>
         <w:rPr>
-          <w:sz w:val="19"/>
+          <w:sz w:val="18"/>
         </w:rPr>
         <w:t>CoStar. (2026c). World Cup’s impact on hotels in Canada underperforms that in US. https://www.costar.com/article/510500866/world-cups-impact-on-hotels-in-canada-underperforms-that-in-us</w:t>
       </w:r>
     </w:p>
     <w:p>
       <w:pPr>
-        <w:spacing w:after="40"/>
+        <w:spacing w:after="20" w:line="240" w:lineRule="auto"/>
         <w:ind w:left="576" w:hanging="576"/>
       </w:pPr>
       <w:r>
         <w:rPr>
-          <w:sz w:val="19"/>
+          <w:sz w:val="18"/>
+        </w:rPr>
+        <w:t>Foodservice and Hospitality. (2026). Rising costs outpace sales growth. https://www.foodserviceandhospitality.com/rising-costs-outpace-sales-growth/</w:t>
+      </w:r>
+    </w:p>
+    <w:p>
+      <w:pPr>
+        <w:spacing w:after="20" w:line="240" w:lineRule="auto"/>
+        <w:ind w:left="576" w:hanging="576"/>
+      </w:pPr>
+      <w:r>
+        <w:rPr>
+          <w:sz w:val="18"/>
+        </w:rPr>
+        <w:t>The Hill Times. (2026, September 29). Feds should reconsider “blanket reductions” of temporary residents, say critics as new data shows record drop. https://hilltimes.com/2026/09/29/feds-should-reconsider-blanket-reductions-of-temporary-residents-say-critics-as-new-data-shows-record-drop/519771</w:t>
+      </w:r>
+    </w:p>
+    <w:p>
+      <w:pPr>
+        <w:spacing w:after="20" w:line="240" w:lineRule="auto"/>
+        <w:ind w:left="576" w:hanging="576"/>
+      </w:pPr>
+      <w:r>
+        <w:rPr>
+          <w:sz w:val="18"/>
+        </w:rPr>
+        <w:t>Hotel Investment Today. (n.d.). Choice continues growth in Canada. https://www.hotelinvestmenttoday.com/Development/Brands/Choice-continues-growth-in-Canada</w:t>
+      </w:r>
+    </w:p>
+    <w:p>
+      <w:pPr>
+        <w:spacing w:after="20" w:line="240" w:lineRule="auto"/>
+        <w:ind w:left="576" w:hanging="576"/>
+      </w:pPr>
+      <w:r>
+        <w:rPr>
+          <w:sz w:val="18"/>
         </w:rPr>
         <w:t>Hotelier Magazine. (2026). Hotels Canada report highlights workforce concerns. https://www.hoteliermagazine.com/hotels-canada-report-highlights-workforce-concerns/</w:t>
       </w:r>
     </w:p>
     <w:p>
       <w:pPr>
-        <w:spacing w:after="40"/>
+        <w:spacing w:after="20" w:line="240" w:lineRule="auto"/>
         <w:ind w:left="576" w:hanging="576"/>
       </w:pPr>
       <w:r>
         <w:rPr>
-          <w:sz w:val="19"/>
+          <w:sz w:val="18"/>
+        </w:rPr>
+        <w:t>Littler. (2026). Canada: Minimum wage increases in 2026. https://www.littler.com/news-analysis/asap/canada-minimum-wage-increases-2026</w:t>
+      </w:r>
+    </w:p>
+    <w:p>
+      <w:pPr>
+        <w:spacing w:after="20" w:line="240" w:lineRule="auto"/>
+        <w:ind w:left="576" w:hanging="576"/>
+      </w:pPr>
+      <w:r>
+        <w:rPr>
+          <w:sz w:val="18"/>
+        </w:rPr>
+        <w:t>NOW Toronto. (2025). “The food is 100 times better,” Canadians are rooting for A&amp;W over McDonald’s amid trade war. https://nowtoronto.com/culture/canadians-rooting-for-canadian-burger-franchise/</w:t>
+      </w:r>
+    </w:p>
+    <w:p>
+      <w:pPr>
+        <w:spacing w:after="20" w:line="240" w:lineRule="auto"/>
+        <w:ind w:left="576" w:hanging="576"/>
+      </w:pPr>
+      <w:r>
+        <w:rPr>
+          <w:sz w:val="18"/>
+        </w:rPr>
+        <w:t>RENX. (2026). Hilton plans 15 new hotels in Canada in 2026. https://renx.ca/index.php/hilton-continues-to-expand-in-canada</w:t>
+      </w:r>
+    </w:p>
+    <w:p>
+      <w:pPr>
+        <w:spacing w:after="20" w:line="240" w:lineRule="auto"/>
+        <w:ind w:left="576" w:hanging="576"/>
+      </w:pPr>
+      <w:r>
+        <w:rPr>
+          <w:sz w:val="18"/>
         </w:rPr>
         <w:t>Restaurant Brands International. (2026). Form 10-Q for the quarterly period ended June 30, 2026. U.S. Securities and Exchange Commission. https://www.sec.gov/Archives/edgar/data/0001618756/000161875626000045/qsr-20260630.htm</w:t>
       </w:r>
     </w:p>
     <w:p>
       <w:pPr>
-        <w:spacing w:after="40"/>
+        <w:spacing w:after="20" w:line="240" w:lineRule="auto"/>
         <w:ind w:left="576" w:hanging="576"/>
       </w:pPr>
       <w:r>
         <w:rPr>
-          <w:sz w:val="19"/>
+          <w:sz w:val="18"/>
         </w:rPr>
-        <w:t>Restaurants Canada. (2026a). 2025 foodservice sales buffered by GST holiday as rising operating costs and tariffs cut into profits. https://www.restaurantscanada.org/2025-foodservice-sales-buffered-by-gst-holiday-as-rising-operating-costs-and-tariffs-cut-into-profits-restaurants-brace-for-more-obstacles-in-2026/</w:t>
+        <w:t>Restaurants Canada. (2026). 2025 foodservice sales buffered by GST holiday as rising operating costs and tariffs cut into profits—Restaurants brace for more obstacles in 2026. https://www.restaurantscanada.org/2025-foodservice-sales-buffered-by-gst-holiday-as-rising-operating-costs-and-tariffs-cut-into-profits-restaurants-brace-for-more-obstacles-in-2026/</w:t>
       </w:r>
     </w:p>
     <w:p>
       <w:pPr>
-        <w:spacing w:after="40"/>
+        <w:spacing w:after="20" w:line="240" w:lineRule="auto"/>
         <w:ind w:left="576" w:hanging="576"/>
       </w:pPr>
       <w:r>
         <w:rPr>
-          <w:sz w:val="19"/>
+          <w:sz w:val="18"/>
         </w:rPr>
-        <w:t>Restaurants Canada. (2026b). Rising costs outpace sales growth [Report coverage]. Foodservice and Hospitality Magazine. https://www.foodserviceandhospitality.com/rising-costs-outpace-sales-growth/</w:t>
+        <w:t>Retail Insider. (2026a, February). Tim Hortons upgrades muffins, espresso and drinks. https://retail-insider.com/retail-insider/2026/02/tim-hortons-upgrades-muffins-espresso-and-drinks/</w:t>
       </w:r>
     </w:p>
     <w:p>
       <w:pPr>
-        <w:spacing w:after="40"/>
+        <w:spacing w:after="20" w:line="240" w:lineRule="auto"/>
         <w:ind w:left="576" w:hanging="576"/>
       </w:pPr>
       <w:r>
         <w:rPr>
-          <w:sz w:val="19"/>
+          <w:sz w:val="18"/>
         </w:rPr>
-        <w:t>Retail Insider. (2026). Tim Hortons targets stronger Canadian growth with new stores, beverages and loyalty. https://retail-insider.com/retail-insider/2026/08/tim-hortons-targets-stronger-canadian-growth-with-new-stores-beverages-and-loyalty/</w:t>
+        <w:t>Retail Insider. (2026b, August). Tim Hortons targets stronger Canadian growth with new stores, beverages and loyalty. https://retail-insider.com/retail-insider/2026/08/tim-hortons-targets-stronger-canadian-growth-with-new-stores-beverages-and-loyalty/</w:t>
       </w:r>
     </w:p>
     <w:p>
       <w:pPr>
-        <w:spacing w:after="40"/>
+        <w:spacing w:after="20" w:line="240" w:lineRule="auto"/>
         <w:ind w:left="576" w:hanging="576"/>
       </w:pPr>
       <w:r>
         <w:rPr>
-          <w:sz w:val="19"/>
+          <w:sz w:val="18"/>
         </w:rPr>
-        <w:t>Statistics Canada. (2026, April 23). Travel between Canada and other countries, February 2026. The Daily. https://www150.statcan.gc.ca/n1/daily-quotidien/260423/dq260423b-eng.htm</w:t>
+        <w:t>Rewards Canada. (2026). Marriott’s new hotel openings in Canada for 2026. https://blog.rewardscanada.ca/new-hotels/new-marriott-hotels-2026/</w:t>
+      </w:r>
+    </w:p>
+    <w:p>
+      <w:pPr>
+        <w:spacing w:after="20" w:line="240" w:lineRule="auto"/>
+        <w:ind w:left="576" w:hanging="576"/>
+      </w:pPr>
+      <w:r>
+        <w:rPr>
+          <w:sz w:val="18"/>
+        </w:rPr>
+        <w:t>Statistics Canada. (2026a, February 23). Travel between Canada and other countries, December 2025. The Daily. https://www150.statcan.gc.ca/n1/daily-quotidien/260223/dq260223a-eng.htm</w:t>
+      </w:r>
+    </w:p>
+    <w:p>
+      <w:pPr>
+        <w:spacing w:after="20" w:line="240" w:lineRule="auto"/>
+        <w:ind w:left="576" w:hanging="576"/>
+      </w:pPr>
+      <w:r>
+        <w:rPr>
+          <w:sz w:val="18"/>
+        </w:rPr>
+        <w:t>Statistics Canada. (2026b, April 23). Travel between Canada and other countries, February 2026. The Daily. https://www150.statcan.gc.ca/n1/daily-quotidien/260423/dq260423b-eng.htm</w:t>
+      </w:r>
+    </w:p>
+    <w:p>
+      <w:pPr>
+        <w:spacing w:after="20" w:line="240" w:lineRule="auto"/>
+        <w:ind w:left="576" w:hanging="576"/>
+      </w:pPr>
+      <w:r>
+        <w:rPr>
+          <w:sz w:val="18"/>
+        </w:rPr>
+        <w:t>TouchBistro. (2026, January 27). Restaurants post strong margins in uneven recovery: TouchBistro’s 2026 Canadian State of Restaurants Report [Press release]. Business Wire. https://www.businesswire.com/news/home/20260127249555/en/</w:t>
       </w:r>
     </w:p>
     <w:sectPr>
+      <w:footerReference w:type="default" r:id="rId9"/>
       <w:pgSz w:w="12240" w:h="15840"/>
-      <w:pgMar w:top="1296" w:right="1440" w:bottom="1296" w:left="1440" w:header="720" w:footer="720" w:gutter="0"/>
+      <w:pgMar w:top="1080" w:right="1296" w:bottom="1080" w:left="1296" w:header="720" w:footer="720" w:gutter="0"/>
       <w:cols w:space="720"/>
       <w:docGrid w:linePitch="360"/>
     </w:sectPr>
   </w:body>
 </w:document>
+</file>
+
+<file path=word/footer1.xml><?xml version="1.0" encoding="utf-8"?>
+<w:ftr xmlns:m="http://schemas.openxmlformats.org/officeDocument/2006/math" xmlns:mc="http://schemas.openxmlformats.org/markup-compatibility/2006" xmlns:mo="http://schemas.microsoft.com/office/mac/office/2008/main" xmlns:mv="urn:schemas-microsoft-com:mac:vml" xmlns:o="urn:schemas-microsoft-com:office:office" xmlns:r="http://schemas.openxmlformats.org/officeDocument/2006/relationships" xmlns:v="urn:schemas-microsoft-com:vml" xmlns:w10="urn:schemas-microsoft-com:office:word" xmlns:w14="http://schemas.microsoft.com/office/word/2010/wordml" xmlns:w="http://schemas.openxmlformats.org/wordprocessingml/2006/main" xmlns:wne="http://schemas.microsoft.com/office/word/2006/wordml" xmlns:wp14="http://schemas.microsoft.com/office/word/2010/wordprocessingDrawing" xmlns:wp="http://schemas.openxmlformats.org/drawingml/2006/wordprocessingDrawing" xmlns:wpc="http://schemas.microsoft.com/office/word/2010/wordprocessingCanvas" xmlns:wpg="http://schemas.microsoft.com/office/word/2010/wordprocessingGroup" xmlns:wpi="http://schemas.microsoft.com/office/word/2010/wordprocessingInk" xmlns:wps="http://schemas.microsoft.com/office/word/2010/wordprocessingShape" mc:Ignorable="w14 wp14">
+  <w:p>
+    <w:pPr>
+      <w:pStyle w:val="Footer"/>
+      <w:jc w:val="right"/>
+    </w:pPr>
+    <w:r>
+      <w:rPr>
+        <w:sz w:val="18"/>
+      </w:rPr>
+      <w:fldChar w:fldCharType="begin"/>
+      <w:instrText xml:space="preserve">PAGE</w:instrText>
+      <w:fldChar w:fldCharType="end"/>
+    </w:r>
+  </w:p>
+</w:ftr>
 </file>
 
 <file path=word/numbering.xml><?xml version="1.0" encoding="utf-8"?>
@@ -1348,7 +2232,7 @@
     <w:qFormat/>
     <w:rsid w:val="00FC693F"/>
     <w:pPr>
-      <w:spacing w:after="100" w:line="259" w:lineRule="auto"/>
+      <w:spacing w:after="80" w:line="240" w:lineRule="auto"/>
     </w:pPr>
     <w:rPr>
       <w:rFonts w:ascii="Calibri" w:hAnsi="Calibri"/>

</xml_diff>

<commit_message>
Add strategy frameworks and top-10 competitor analysis; verify all data
Rebuild report with PESTEL, Porter's Five Forces, generic strategies and
TOWS recommendations. Correct World Cup spending and restaurant forecast
figures against primary sources, re-attribute Restaurants Canada data, and
condense to 4 pages.

Co-Authored-By: Claude Opus 5.5 <noreply@anthropic.com>
Claude-Session: https://claude.ai/code/session_01JTamVxrTv7V6U77E6LC8gu
</commit_message>
<xml_diff>
--- a/MGMT6121/Environmental_Scanning_Hospitality_Canada.docx
+++ b/MGMT6121/Environmental_Scanning_Hospitality_Canada.docx
@@ -54,7 +54,7 @@
           <w:color w:val="1F3A5F"/>
           <w:sz w:val="25"/>
         </w:rPr>
-        <w:t>1. Introduction and Industry Snapshot</w:t>
+        <w:t>1. Introduction</w:t>
       </w:r>
     </w:p>
     <w:p>
@@ -62,15 +62,7 @@
         <w:rPr>
           <w:i w:val="0"/>
         </w:rPr>
-        <w:t>This report scans the external environment of Canada’s hospitality industry, defined here as accommodation (hotels and resorts) and foodservice (quick-service, full-service and independent restaurants). The evidence comes from industry associations (Restaurants Canada, Hotels Canada), market data (CoStar), Statistics Canada, company filings, news coverage and consumer conversations on Reddit and TikTok.</w:t>
-      </w:r>
-    </w:p>
-    <w:p>
-      <w:r>
-        <w:rPr>
-          <w:i w:val="0"/>
-        </w:rPr>
-        <w:t>The main finding is that demand is holding up, but profitability is not. Hotels had their best year on record in 2025, with occupancy of 66.1%, an average daily rate (ADR) of $216.10 and revenue per available room (RevPAR) of $142.89 (CoStar, 2026a). Restaurants are in a weaker position. Total foodservice sales are forecast to grow only 2.1% in 2026, and 41% of operators say they are losing money or breaking even (Foodservice and Hospitality, 2026; Restaurants Canada, 2026). The sections below explain the forces behind this gap and how operators can respond.</w:t>
+        <w:t>This report scans the external environment of Canada’s hotel and restaurant industry using three strategy tools: PESTEL for the macro environment, Porter’s Five Forces and generic strategies for competition, and a TOWS matrix for recommendations. The main finding is that demand is holding up but margins are not. Hotels set a record in 2025, with occupancy of 66.1%, an average daily rate (ADR) of $216.10 and revenue per available room (RevPAR) of $142.89 (CoStar, 2026a). Restaurants, by contrast, earn an average pre-tax margin of just 4.1%, and 41% of operators are losing money or breaking even (Restaurants Canada, 2026a, 2026b).</w:t>
       </w:r>
     </w:p>
     <w:p>
@@ -84,18 +76,7 @@
           <w:color w:val="1F3A5F"/>
           <w:sz w:val="25"/>
         </w:rPr>
-        <w:t>2. Key External Factors</w:t>
-      </w:r>
-    </w:p>
-    <w:p>
-      <w:pPr>
-        <w:spacing w:after="60"/>
-      </w:pPr>
-      <w:r>
-        <w:rPr>
-          <w:i w:val="0"/>
-        </w:rPr>
-        <w:t>Table 1 summarizes the most important external influences, the evidence behind each one, and what it means for hotels and restaurants.</w:t>
+        <w:t>2. Key External Factors (PESTEL)</w:t>
       </w:r>
     </w:p>
     <w:tbl>
@@ -107,8 +88,8 @@
       </w:tblPr>
       <w:tblGrid>
         <w:gridCol w:w="1728"/>
-        <w:gridCol w:w="4680"/>
-        <w:gridCol w:w="3600"/>
+        <w:gridCol w:w="4968"/>
+        <w:gridCol w:w="3312"/>
       </w:tblGrid>
       <w:tr>
         <w:trPr>
@@ -136,7 +117,7 @@
         </w:tc>
         <w:tc>
           <w:tcPr>
-            <w:tcW w:type="dxa" w:w="4680"/>
+            <w:tcW w:type="dxa" w:w="4968"/>
             <w:shd w:val="clear" w:color="auto" w:fill="1F3A5F"/>
           </w:tcPr>
           <w:p>
@@ -150,13 +131,13 @@
                 <w:color w:val="FFFFFF"/>
                 <w:sz w:val="18"/>
               </w:rPr>
-              <w:t>Current development (evidence)</w:t>
+              <w:t>Evidence</w:t>
             </w:r>
           </w:p>
         </w:tc>
         <w:tc>
           <w:tcPr>
-            <w:tcW w:type="dxa" w:w="3600"/>
+            <w:tcW w:type="dxa" w:w="3312"/>
             <w:shd w:val="clear" w:color="auto" w:fill="1F3A5F"/>
           </w:tcPr>
           <w:p>
@@ -170,7 +151,7 @@
                 <w:color w:val="FFFFFF"/>
                 <w:sz w:val="18"/>
               </w:rPr>
-              <w:t>Impact on the industry</w:t>
+              <w:t>Impact</w:t>
             </w:r>
           </w:p>
         </w:tc>
@@ -197,7 +178,7 @@
         </w:tc>
         <w:tc>
           <w:tcPr>
-            <w:tcW w:type="dxa" w:w="4680"/>
+            <w:tcW w:type="dxa" w:w="4968"/>
           </w:tcPr>
           <w:p>
             <w:pPr>
@@ -208,13 +189,13 @@
               <w:rPr>
                 <w:sz w:val="18"/>
               </w:rPr>
-              <w:t>Food costs are a top concern for 88% of restaurant operators and labour costs for 89%. Two one-time boosts to 2025 sales, the GST/HST holiday and travel money spent at home instead of in the U.S., are fading in 2026 (Foodservice and Hospitality, 2026; Restaurants Canada, 2026). Hotel growth now comes mostly from price: in June 2026, occupancy fell 3.5% while ADR rose 5.4% (CoStar, 2026b).</w:t>
+              <w:t>Food costs worry 88% of restaurant operators and labour costs 89%. Real foodservice sales are forecast to grow only 1.5% in 2026 (Restaurants Canada, 2026b). Hotel growth now comes from price: in June 2026, occupancy fell 3.5% while ADR rose 5.4% (CoStar, 2026b).</w:t>
             </w:r>
           </w:p>
         </w:tc>
         <w:tc>
           <w:tcPr>
-            <w:tcW w:type="dxa" w:w="3600"/>
+            <w:tcW w:type="dxa" w:w="3312"/>
           </w:tcPr>
           <w:p>
             <w:pPr>
@@ -225,7 +206,7 @@
               <w:rPr>
                 <w:sz w:val="18"/>
               </w:rPr>
-              <w:t>Margins are being squeezed from both sides. Restaurants cannot raise prices much further without losing value-conscious guests, and hotels cannot rely on rate increases if fewer rooms are filled.</w:t>
+              <w:t>Margins are squeezed. Rate-led hotel growth has limits.</w:t>
             </w:r>
           </w:p>
         </w:tc>
@@ -246,13 +227,13 @@
                 <w:b/>
                 <w:sz w:val="18"/>
               </w:rPr>
-              <w:t>Political and legal</w:t>
+              <w:t>Political</w:t>
             </w:r>
           </w:p>
         </w:tc>
         <w:tc>
           <w:tcPr>
-            <w:tcW w:type="dxa" w:w="4680"/>
+            <w:tcW w:type="dxa" w:w="4968"/>
           </w:tcPr>
           <w:p>
             <w:pPr>
@@ -263,13 +244,13 @@
               <w:rPr>
                 <w:sz w:val="18"/>
               </w:rPr>
-              <w:t>Because of the tariff dispute, Canadian return trips from the U.S. fell 25.4% to 29.1 million in 2025 (Statistics Canada, 2026a), and the decline continued for a 14th straight month in February 2026 (Statistics Canada, 2026b). Ottawa continues to cut temporary resident numbers (The Hill Times, 2026). Minimum wages rise each year with inflation: the federal rate is $18.15 (April 2026), B.C. $18.25 (June 2026) and Ontario $17.95 (October 2026) (Littler, 2026). The Competition Act now bans drip pricing, and Quebec’s Law 25 tightens consent rules for personal data.</w:t>
+              <w:t>Because of the tariff dispute, Canadian return trips from the U.S. fell 25.4% to 29.1 million in 2025 (Statistics Canada, 2026a), with a 14th straight monthly decline in February 2026 (Statistics Canada, 2026b). Ottawa’s Canada Strong Pass (June 19 to September 7, 2026) offered free national park entry to encourage domestic travel (Parks Canada, n.d.).</w:t>
             </w:r>
           </w:p>
         </w:tc>
         <w:tc>
           <w:tcPr>
-            <w:tcW w:type="dxa" w:w="3600"/>
+            <w:tcW w:type="dxa" w:w="3312"/>
           </w:tcPr>
           <w:p>
             <w:pPr>
@@ -280,7 +261,62 @@
               <w:rPr>
                 <w:sz w:val="18"/>
               </w:rPr>
-              <w:t>Domestic demand gets a boost, but labour costs go up while the supply of workers shrinks. Advertised prices must include mandatory fees, such as resort fees. Collecting guest data for analytics now requires clear consent.</w:t>
+              <w:t>Domestic leisure demand rises. U.S.-linked demand stays weak.</w:t>
+            </w:r>
+          </w:p>
+        </w:tc>
+      </w:tr>
+      <w:tr>
+        <w:tc>
+          <w:tcPr>
+            <w:tcW w:type="dxa" w:w="1728"/>
+            <w:shd w:val="clear" w:color="auto" w:fill="E8EEF5"/>
+          </w:tcPr>
+          <w:p>
+            <w:pPr>
+              <w:spacing w:after="0" w:line="240" w:lineRule="auto"/>
+            </w:pPr>
+            <w:r/>
+            <w:r>
+              <w:rPr>
+                <w:b/>
+                <w:sz w:val="18"/>
+              </w:rPr>
+              <w:t>Legal</w:t>
+            </w:r>
+          </w:p>
+        </w:tc>
+        <w:tc>
+          <w:tcPr>
+            <w:tcW w:type="dxa" w:w="4968"/>
+          </w:tcPr>
+          <w:p>
+            <w:pPr>
+              <w:spacing w:after="0" w:line="240" w:lineRule="auto"/>
+            </w:pPr>
+            <w:r/>
+            <w:r>
+              <w:rPr>
+                <w:sz w:val="18"/>
+              </w:rPr>
+              <w:t>Minimum wages rise each year with inflation: the federal rate is $18.15, B.C. $18.25 and Ontario $17.95 (Littler, 2026). Bill C-59 (2024) bans drip pricing, so mandatory fees must appear in the advertised price (Davies, 2024). B.C. requires short-term rental registration (Government of British Columbia, n.d.). Quebec’s Law 25 tightens consent rules for personal data.</w:t>
+            </w:r>
+          </w:p>
+        </w:tc>
+        <w:tc>
+          <w:tcPr>
+            <w:tcW w:type="dxa" w:w="3312"/>
+          </w:tcPr>
+          <w:p>
+            <w:pPr>
+              <w:spacing w:after="0" w:line="240" w:lineRule="auto"/>
+            </w:pPr>
+            <w:r/>
+            <w:r>
+              <w:rPr>
+                <w:sz w:val="18"/>
+              </w:rPr>
+              <w:t>Labour costs rise. Resort fees must be shown upfront. Guest data needs clear consent.</w:t>
             </w:r>
           </w:p>
         </w:tc>
@@ -307,7 +343,7 @@
         </w:tc>
         <w:tc>
           <w:tcPr>
-            <w:tcW w:type="dxa" w:w="4680"/>
+            <w:tcW w:type="dxa" w:w="4968"/>
           </w:tcPr>
           <w:p>
             <w:pPr>
@@ -318,13 +354,13 @@
               <w:rPr>
                 <w:sz w:val="18"/>
               </w:rPr>
-              <w:t>83% of Canadians say too many businesses ask for tips, and 59% would prefer a no-tipping model with higher wages (Angus Reid Institute, 2023). The “Buy Canadian” movement has rewarded Canadian-owned brands. A&amp;W’s “Canadian owned and managed” signage was widely praised online (NOW Toronto, 2025). Reddit threads such as r/PersonalFinanceCanada are full of people cutting back on dining out.</w:t>
+              <w:t>80% of Canadians are eating out less because of the cost of living (Restaurants Canada, 2026a). 83% say too many businesses ask for tips (Angus Reid Institute, 2023). “Buy Canadian” sentiment has favoured local brands such as A&amp;W (NOW Toronto, 2025).</w:t>
             </w:r>
           </w:p>
         </w:tc>
         <w:tc>
           <w:tcPr>
-            <w:tcW w:type="dxa" w:w="3600"/>
+            <w:tcW w:type="dxa" w:w="3312"/>
           </w:tcPr>
           <w:p>
             <w:pPr>
@@ -335,7 +371,7 @@
               <w:rPr>
                 <w:sz w:val="18"/>
               </w:rPr>
-              <w:t>Guests choose more carefully and expect honest, transparent pricing. Local identity is now a real source of competitive advantage.</w:t>
+              <w:t>Guests are price-sensitive and loyal to local brands.</w:t>
             </w:r>
           </w:p>
         </w:tc>
@@ -362,7 +398,7 @@
         </w:tc>
         <w:tc>
           <w:tcPr>
-            <w:tcW w:type="dxa" w:w="4680"/>
+            <w:tcW w:type="dxa" w:w="4968"/>
           </w:tcPr>
           <w:p>
             <w:pPr>
@@ -373,13 +409,13 @@
               <w:rPr>
                 <w:sz w:val="18"/>
               </w:rPr>
-              <w:t>79% of independent Canadian restaurant operators feel positive about using AI (TouchBistro, 2026). Self-order kiosks, mobile ordering, digital room keys, chatbots and automated revenue-management systems are becoming standard.</w:t>
+              <w:t>79% of independent restaurant operators feel positive about AI (TouchBistro, 2026). Kiosks, mobile ordering, digital room keys and revenue-management tools are now mainstream.</w:t>
             </w:r>
           </w:p>
         </w:tc>
         <w:tc>
           <w:tcPr>
-            <w:tcW w:type="dxa" w:w="3600"/>
+            <w:tcW w:type="dxa" w:w="3312"/>
           </w:tcPr>
           <w:p>
             <w:pPr>
@@ -390,7 +426,7 @@
               <w:rPr>
                 <w:sz w:val="18"/>
               </w:rPr>
-              <w:t>Technology reduces dependence on scarce labour and produces large amounts of data, but many operators still do not turn that data into decisions.</w:t>
+              <w:t>Technology cuts labour needs and creates data to use.</w:t>
             </w:r>
           </w:p>
         </w:tc>
@@ -417,7 +453,7 @@
         </w:tc>
         <w:tc>
           <w:tcPr>
-            <w:tcW w:type="dxa" w:w="4680"/>
+            <w:tcW w:type="dxa" w:w="4968"/>
           </w:tcPr>
           <w:p>
             <w:pPr>
@@ -428,13 +464,13 @@
               <w:rPr>
                 <w:sz w:val="18"/>
               </w:rPr>
-              <w:t>The 2024 Jasper wildfire destroyed hundreds of structures and shut a major resort town during peak season. Wildfire smoke, extreme weather and federal rules on single-use plastics now shape operations. Corporate travel buyers increasingly ask about food waste and energy use.</w:t>
+              <w:t>The 2024 Jasper wildfire shut a major resort town in peak season. Smoke and extreme weather recur. Clients increasingly ask about food waste and energy use.</w:t>
             </w:r>
           </w:p>
         </w:tc>
         <w:tc>
           <w:tcPr>
-            <w:tcW w:type="dxa" w:w="3600"/>
+            <w:tcW w:type="dxa" w:w="3312"/>
           </w:tcPr>
           <w:p>
             <w:pPr>
@@ -445,23 +481,12 @@
               <w:rPr>
                 <w:sz w:val="18"/>
               </w:rPr>
-              <w:t>Seasonal revenue becomes harder to predict, insurance and compliance costs rise, and sustainability becomes a factor when clients choose a venue.</w:t>
+              <w:t>Seasonal risk rises and sustainability influences buying decisions.</w:t>
             </w:r>
           </w:p>
         </w:tc>
       </w:tr>
     </w:tbl>
-    <w:p>
-      <w:pPr>
-        <w:spacing w:before="80"/>
-      </w:pPr>
-      <w:r>
-        <w:rPr>
-          <w:i w:val="0"/>
-        </w:rPr>
-        <w:t>Taken together, these factors show an industry where demand is shifting toward domestic and value-conscious guests just as operating costs and labour constraints become harder to manage.</w:t>
-      </w:r>
-    </w:p>
     <w:p>
       <w:pPr>
         <w:keepNext/>
@@ -482,9 +507,15 @@
       </w:pPr>
       <w:r>
         <w:rPr>
+          <w:b/>
+        </w:rPr>
+        <w:t xml:space="preserve">3.1 Industry structure. </w:t>
+      </w:r>
+      <w:r>
+        <w:rPr>
           <w:i w:val="0"/>
         </w:rPr>
-        <w:t>The market is split between large, well-funded chains and a long tail of independent operators. All of them are also competing with platforms and substitutes. Table 2 profiles the major players.</w:t>
+        <w:t>Porter’s Five Forces (Table 2) shows an industry where it is hard to earn above-average profits.</w:t>
       </w:r>
     </w:p>
     <w:tbl>
@@ -496,9 +527,8 @@
       </w:tblPr>
       <w:tblGrid>
         <w:gridCol w:w="1728"/>
-        <w:gridCol w:w="2664"/>
-        <w:gridCol w:w="2520"/>
-        <w:gridCol w:w="3096"/>
+        <w:gridCol w:w="1440"/>
+        <w:gridCol w:w="6840"/>
       </w:tblGrid>
       <w:tr>
         <w:trPr>
@@ -520,13 +550,13 @@
                 <w:color w:val="FFFFFF"/>
                 <w:sz w:val="18"/>
               </w:rPr>
-              <w:t>Competitor</w:t>
+              <w:t>Force</w:t>
             </w:r>
           </w:p>
         </w:tc>
         <w:tc>
           <w:tcPr>
-            <w:tcW w:type="dxa" w:w="2664"/>
+            <w:tcW w:type="dxa" w:w="1440"/>
             <w:shd w:val="clear" w:color="auto" w:fill="1F3A5F"/>
           </w:tcPr>
           <w:p>
@@ -540,13 +570,13 @@
                 <w:color w:val="FFFFFF"/>
                 <w:sz w:val="18"/>
               </w:rPr>
-              <w:t>Strengths</w:t>
+              <w:t>Level</w:t>
             </w:r>
           </w:p>
         </w:tc>
         <w:tc>
           <w:tcPr>
-            <w:tcW w:type="dxa" w:w="2520"/>
+            <w:tcW w:type="dxa" w:w="6840"/>
             <w:shd w:val="clear" w:color="auto" w:fill="1F3A5F"/>
           </w:tcPr>
           <w:p>
@@ -560,27 +590,7 @@
                 <w:color w:val="FFFFFF"/>
                 <w:sz w:val="18"/>
               </w:rPr>
-              <w:t>Weaknesses</w:t>
-            </w:r>
-          </w:p>
-        </w:tc>
-        <w:tc>
-          <w:tcPr>
-            <w:tcW w:type="dxa" w:w="3096"/>
-            <w:shd w:val="clear" w:color="auto" w:fill="1F3A5F"/>
-          </w:tcPr>
-          <w:p>
-            <w:pPr>
-              <w:spacing w:after="0" w:line="240" w:lineRule="auto"/>
-            </w:pPr>
-            <w:r/>
-            <w:r>
-              <w:rPr>
-                <w:b/>
-                <w:color w:val="FFFFFF"/>
-                <w:sz w:val="18"/>
-              </w:rPr>
-              <w:t>Recent strategic moves</w:t>
+              <w:t>Evidence</w:t>
             </w:r>
           </w:p>
         </w:tc>
@@ -601,13 +611,13 @@
                 <w:b/>
                 <w:sz w:val="18"/>
               </w:rPr>
-              <w:t>Tim Hortons (Restaurant Brands International)</w:t>
+              <w:t>Rivalry</w:t>
             </w:r>
           </w:p>
         </w:tc>
         <w:tc>
           <w:tcPr>
-            <w:tcW w:type="dxa" w:w="2664"/>
+            <w:tcW w:type="dxa" w:w="1440"/>
           </w:tcPr>
           <w:p>
             <w:pPr>
@@ -618,13 +628,13 @@
               <w:rPr>
                 <w:sz w:val="18"/>
               </w:rPr>
-              <w:t>6,209 restaurants worldwide, mostly in Canada; 20 straight quarters of positive same-store sales; strong purchasing power</w:t>
+              <w:t>High</w:t>
             </w:r>
           </w:p>
         </w:tc>
         <w:tc>
           <w:tcPr>
-            <w:tcW w:type="dxa" w:w="2520"/>
+            <w:tcW w:type="dxa" w:w="6840"/>
           </w:tcPr>
           <w:p>
             <w:pPr>
@@ -635,24 +645,7 @@
               <w:rPr>
                 <w:sz w:val="18"/>
               </w:rPr>
-              <w:t>Canadian same-store sales growth slowed from 3.6% to almost zero by Q2 2026</w:t>
-            </w:r>
-          </w:p>
-        </w:tc>
-        <w:tc>
-          <w:tcPr>
-            <w:tcW w:type="dxa" w:w="3096"/>
-          </w:tcPr>
-          <w:p>
-            <w:pPr>
-              <w:spacing w:after="0" w:line="240" w:lineRule="auto"/>
-            </w:pPr>
-            <w:r/>
-            <w:r>
-              <w:rPr>
-                <w:sz w:val="18"/>
-              </w:rPr>
-              <w:t>“Back-to-basics” menu upgrades (espresso, muffins, fountain drinks); new stores; loyalty partnership with Canadian Tire (Restaurant Brands International, 2026; Retail Insider, 2026a, 2026b)</w:t>
+              <w:t>Supply keeps growing (Marriott is adding about 11 hotels and Hilton about 15 in 2026) while occupancy softens. Quick-service chains are competing hard on value.</w:t>
             </w:r>
           </w:p>
         </w:tc>
@@ -673,13 +666,13 @@
                 <w:b/>
                 <w:sz w:val="18"/>
               </w:rPr>
-              <w:t>A&amp;W Canada</w:t>
+              <w:t>Buyer power</w:t>
             </w:r>
           </w:p>
         </w:tc>
         <w:tc>
           <w:tcPr>
-            <w:tcW w:type="dxa" w:w="2664"/>
+            <w:tcW w:type="dxa" w:w="1440"/>
           </w:tcPr>
           <w:p>
             <w:pPr>
@@ -690,13 +683,13 @@
               <w:rPr>
                 <w:sz w:val="18"/>
               </w:rPr>
-              <w:t>More than 1,000 Canadian locations; Canadian-owned and separate from the U.S. chain; ingredient-led brand</w:t>
+              <w:t>High</w:t>
             </w:r>
           </w:p>
         </w:tc>
         <w:tc>
           <w:tcPr>
-            <w:tcW w:type="dxa" w:w="2520"/>
+            <w:tcW w:type="dxa" w:w="6840"/>
           </w:tcPr>
           <w:p>
             <w:pPr>
@@ -707,24 +700,7 @@
               <w:rPr>
                 <w:sz w:val="18"/>
               </w:rPr>
-              <w:t>Smaller scale and marketing budget than McDonald’s; exposed to the same labour constraints as other quick-service chains</w:t>
-            </w:r>
-          </w:p>
-        </w:tc>
-        <w:tc>
-          <w:tcPr>
-            <w:tcW w:type="dxa" w:w="3096"/>
-          </w:tcPr>
-          <w:p>
-            <w:pPr>
-              <w:spacing w:after="0" w:line="240" w:lineRule="auto"/>
-            </w:pPr>
-            <w:r/>
-            <w:r>
-              <w:rPr>
-                <w:sz w:val="18"/>
-              </w:rPr>
-              <w:t>Displayed “Canadian owned and managed” signage during the trade war and gained goodwill on social media (NOW Toronto, 2025)</w:t>
+              <w:t>80% of consumers are cutting back. Price transparency (Bill C-59) and online reviews make prices easy to compare.</w:t>
             </w:r>
           </w:p>
         </w:tc>
@@ -745,13 +721,13 @@
                 <w:b/>
                 <w:sz w:val="18"/>
               </w:rPr>
-              <w:t>Recipe Unlimited (Fairfax)</w:t>
+              <w:t>Supplier power</w:t>
             </w:r>
           </w:p>
         </w:tc>
         <w:tc>
           <w:tcPr>
-            <w:tcW w:type="dxa" w:w="2664"/>
+            <w:tcW w:type="dxa" w:w="1440"/>
           </w:tcPr>
           <w:p>
             <w:pPr>
@@ -762,13 +738,13 @@
               <w:rPr>
                 <w:sz w:val="18"/>
               </w:rPr>
-              <w:t>Large multi-brand portfolio (Swiss Chalet, Harvey’s, The Keg) across price points</w:t>
+              <w:t>Moderate to high</w:t>
             </w:r>
           </w:p>
         </w:tc>
         <w:tc>
           <w:tcPr>
-            <w:tcW w:type="dxa" w:w="2520"/>
+            <w:tcW w:type="dxa" w:w="6840"/>
           </w:tcPr>
           <w:p>
             <w:pPr>
@@ -779,24 +755,7 @@
               <w:rPr>
                 <w:sz w:val="18"/>
               </w:rPr>
-              <w:t>Heavy exposure to casual dining, the segment hit hardest by tight household budgets</w:t>
-            </w:r>
-          </w:p>
-        </w:tc>
-        <w:tc>
-          <w:tcPr>
-            <w:tcW w:type="dxa" w:w="3096"/>
-          </w:tcPr>
-          <w:p>
-            <w:pPr>
-              <w:spacing w:after="0" w:line="240" w:lineRule="auto"/>
-            </w:pPr>
-            <w:r/>
-            <w:r>
-              <w:rPr>
-                <w:sz w:val="18"/>
-              </w:rPr>
-              <w:t>Private ownership since 2022 allows restructuring without quarterly market pressure</w:t>
+              <w:t>Food inflation, a tighter labour supply (46% of hotels lost foreign workers to expiring permits; Hotelier Magazine, 2026), and commissions charged by booking and delivery platforms.</w:t>
             </w:r>
           </w:p>
         </w:tc>
@@ -817,13 +776,13 @@
                 <w:b/>
                 <w:sz w:val="18"/>
               </w:rPr>
-              <w:t>Marriott, Hilton and Choice Hotels</w:t>
+              <w:t>Substitutes</w:t>
             </w:r>
           </w:p>
         </w:tc>
         <w:tc>
           <w:tcPr>
-            <w:tcW w:type="dxa" w:w="2664"/>
+            <w:tcW w:type="dxa" w:w="1440"/>
           </w:tcPr>
           <w:p>
             <w:pPr>
@@ -834,13 +793,13 @@
               <w:rPr>
                 <w:sz w:val="18"/>
               </w:rPr>
-              <w:t>Marriott has 300+ Canadian hotels and Hilton 200+; large loyalty programs and booking engines</w:t>
+              <w:t>Moderate to high</w:t>
             </w:r>
           </w:p>
         </w:tc>
         <w:tc>
           <w:tcPr>
-            <w:tcW w:type="dxa" w:w="2520"/>
+            <w:tcW w:type="dxa" w:w="6840"/>
           </w:tcPr>
           <w:p>
             <w:pPr>
@@ -851,24 +810,7 @@
               <w:rPr>
                 <w:sz w:val="18"/>
               </w:rPr>
-              <w:t>Rely on rate growth; summer 2026 occupancy softened; owners pay high franchise fees</w:t>
-            </w:r>
-          </w:p>
-        </w:tc>
-        <w:tc>
-          <w:tcPr>
-            <w:tcW w:type="dxa" w:w="3096"/>
-          </w:tcPr>
-          <w:p>
-            <w:pPr>
-              <w:spacing w:after="0" w:line="240" w:lineRule="auto"/>
-            </w:pPr>
-            <w:r/>
-            <w:r>
-              <w:rPr>
-                <w:sz w:val="18"/>
-              </w:rPr>
-              <w:t>Marriott is adding about 11 hotels and Hilton about 15 in 2026, including midscale Spark by Hilton. Choice is opening six Ascend Collection hotels in Quebec (Rewards Canada, 2026; RENX, 2026; Hotel Investment Today, n.d.)</w:t>
+              <w:t>Airbnb, grocery prepared meals and cooking at home.</w:t>
             </w:r>
           </w:p>
         </w:tc>
@@ -889,13 +831,13 @@
                 <w:b/>
                 <w:sz w:val="18"/>
               </w:rPr>
-              <w:t>Independent restaurants and hotels</w:t>
+              <w:t>New entrants</w:t>
             </w:r>
           </w:p>
         </w:tc>
         <w:tc>
           <w:tcPr>
-            <w:tcW w:type="dxa" w:w="2664"/>
+            <w:tcW w:type="dxa" w:w="1440"/>
           </w:tcPr>
           <w:p>
             <w:pPr>
@@ -906,7 +848,233 @@
               <w:rPr>
                 <w:sz w:val="18"/>
               </w:rPr>
-              <w:t>Local identity, flexibility and authentic stories that perform well on social media</w:t>
+              <w:t>Moderate</w:t>
+            </w:r>
+          </w:p>
+        </w:tc>
+        <w:tc>
+          <w:tcPr>
+            <w:tcW w:type="dxa" w:w="6840"/>
+          </w:tcPr>
+          <w:p>
+            <w:pPr>
+              <w:spacing w:after="0" w:line="240" w:lineRule="auto"/>
+            </w:pPr>
+            <w:r/>
+            <w:r>
+              <w:rPr>
+                <w:sz w:val="18"/>
+              </w:rPr>
+              <w:t>Opening a restaurant is easy, but a 4.1% average margin deters newcomers. Hotels require heavy capital.</w:t>
+            </w:r>
+          </w:p>
+        </w:tc>
+      </w:tr>
+    </w:tbl>
+    <w:p>
+      <w:pPr>
+        <w:spacing w:after="60" w:before="100"/>
+      </w:pPr>
+      <w:r>
+        <w:rPr>
+          <w:b/>
+        </w:rPr>
+        <w:t xml:space="preserve">3.2 Top 10 competitors. </w:t>
+      </w:r>
+      <w:r>
+        <w:rPr>
+          <w:i w:val="0"/>
+        </w:rPr>
+        <w:t>Table 3 profiles the ten most important competitors, including the generic strategy each one follows.</w:t>
+      </w:r>
+    </w:p>
+    <w:tbl>
+      <w:tblPr>
+        <w:tblStyle w:val="TableGrid"/>
+        <w:tblW w:type="auto" w:w="0"/>
+        <w:tblLayout w:type="fixed"/>
+        <w:tblLook w:firstColumn="1" w:firstRow="1" w:lastColumn="0" w:lastRow="0" w:noHBand="0" w:noVBand="1" w:val="04A0"/>
+      </w:tblPr>
+      <w:tblGrid>
+        <w:gridCol w:w="1656"/>
+        <w:gridCol w:w="1656"/>
+        <w:gridCol w:w="2160"/>
+        <w:gridCol w:w="2016"/>
+        <w:gridCol w:w="2520"/>
+      </w:tblGrid>
+      <w:tr>
+        <w:trPr>
+          <w:tblHeader w:val="true"/>
+        </w:trPr>
+        <w:tc>
+          <w:tcPr>
+            <w:tcW w:type="dxa" w:w="1656"/>
+            <w:shd w:val="clear" w:color="auto" w:fill="1F3A5F"/>
+          </w:tcPr>
+          <w:p>
+            <w:pPr>
+              <w:spacing w:after="0" w:line="240" w:lineRule="auto"/>
+            </w:pPr>
+            <w:r/>
+            <w:r>
+              <w:rPr>
+                <w:b/>
+                <w:color w:val="FFFFFF"/>
+                <w:sz w:val="18"/>
+              </w:rPr>
+              <w:t>Competitor</w:t>
+            </w:r>
+          </w:p>
+        </w:tc>
+        <w:tc>
+          <w:tcPr>
+            <w:tcW w:type="dxa" w:w="1656"/>
+            <w:shd w:val="clear" w:color="auto" w:fill="1F3A5F"/>
+          </w:tcPr>
+          <w:p>
+            <w:pPr>
+              <w:spacing w:after="0" w:line="240" w:lineRule="auto"/>
+            </w:pPr>
+            <w:r/>
+            <w:r>
+              <w:rPr>
+                <w:b/>
+                <w:color w:val="FFFFFF"/>
+                <w:sz w:val="18"/>
+              </w:rPr>
+              <w:t>Segment / strategy</w:t>
+            </w:r>
+          </w:p>
+        </w:tc>
+        <w:tc>
+          <w:tcPr>
+            <w:tcW w:type="dxa" w:w="2160"/>
+            <w:shd w:val="clear" w:color="auto" w:fill="1F3A5F"/>
+          </w:tcPr>
+          <w:p>
+            <w:pPr>
+              <w:spacing w:after="0" w:line="240" w:lineRule="auto"/>
+            </w:pPr>
+            <w:r/>
+            <w:r>
+              <w:rPr>
+                <w:b/>
+                <w:color w:val="FFFFFF"/>
+                <w:sz w:val="18"/>
+              </w:rPr>
+              <w:t>Strength</w:t>
+            </w:r>
+          </w:p>
+        </w:tc>
+        <w:tc>
+          <w:tcPr>
+            <w:tcW w:type="dxa" w:w="2016"/>
+            <w:shd w:val="clear" w:color="auto" w:fill="1F3A5F"/>
+          </w:tcPr>
+          <w:p>
+            <w:pPr>
+              <w:spacing w:after="0" w:line="240" w:lineRule="auto"/>
+            </w:pPr>
+            <w:r/>
+            <w:r>
+              <w:rPr>
+                <w:b/>
+                <w:color w:val="FFFFFF"/>
+                <w:sz w:val="18"/>
+              </w:rPr>
+              <w:t>Weakness</w:t>
+            </w:r>
+          </w:p>
+        </w:tc>
+        <w:tc>
+          <w:tcPr>
+            <w:tcW w:type="dxa" w:w="2520"/>
+            <w:shd w:val="clear" w:color="auto" w:fill="1F3A5F"/>
+          </w:tcPr>
+          <w:p>
+            <w:pPr>
+              <w:spacing w:after="0" w:line="240" w:lineRule="auto"/>
+            </w:pPr>
+            <w:r/>
+            <w:r>
+              <w:rPr>
+                <w:b/>
+                <w:color w:val="FFFFFF"/>
+                <w:sz w:val="18"/>
+              </w:rPr>
+              <w:t>Recent move</w:t>
+            </w:r>
+          </w:p>
+        </w:tc>
+      </w:tr>
+      <w:tr>
+        <w:tc>
+          <w:tcPr>
+            <w:tcW w:type="dxa" w:w="1656"/>
+            <w:shd w:val="clear" w:color="auto" w:fill="E8EEF5"/>
+          </w:tcPr>
+          <w:p>
+            <w:pPr>
+              <w:spacing w:after="0" w:line="240" w:lineRule="auto"/>
+            </w:pPr>
+            <w:r/>
+            <w:r>
+              <w:rPr>
+                <w:b/>
+                <w:sz w:val="18"/>
+              </w:rPr>
+              <w:t>Tim Hortons (RBI)</w:t>
+            </w:r>
+          </w:p>
+        </w:tc>
+        <w:tc>
+          <w:tcPr>
+            <w:tcW w:type="dxa" w:w="1656"/>
+          </w:tcPr>
+          <w:p>
+            <w:pPr>
+              <w:spacing w:after="0" w:line="240" w:lineRule="auto"/>
+            </w:pPr>
+            <w:r/>
+            <w:r>
+              <w:rPr>
+                <w:sz w:val="18"/>
+              </w:rPr>
+              <w:t>Coffee QSR / cost leadership</w:t>
+            </w:r>
+          </w:p>
+        </w:tc>
+        <w:tc>
+          <w:tcPr>
+            <w:tcW w:type="dxa" w:w="2160"/>
+          </w:tcPr>
+          <w:p>
+            <w:pPr>
+              <w:spacing w:after="0" w:line="240" w:lineRule="auto"/>
+            </w:pPr>
+            <w:r/>
+            <w:r>
+              <w:rPr>
+                <w:sz w:val="18"/>
+              </w:rPr>
+              <w:t>6,209 restaurants; strong national brand</w:t>
+            </w:r>
+          </w:p>
+        </w:tc>
+        <w:tc>
+          <w:tcPr>
+            <w:tcW w:type="dxa" w:w="2016"/>
+          </w:tcPr>
+          <w:p>
+            <w:pPr>
+              <w:spacing w:after="0" w:line="240" w:lineRule="auto"/>
+            </w:pPr>
+            <w:r/>
+            <w:r>
+              <w:rPr>
+                <w:sz w:val="18"/>
+              </w:rPr>
+              <w:t>Canadian same-store sales slowed to 0.1% in Q2 2026</w:t>
             </w:r>
           </w:p>
         </w:tc>
@@ -923,24 +1091,7 @@
               <w:rPr>
                 <w:sz w:val="18"/>
               </w:rPr>
-              <w:t>Thin margins, little purchasing power and smaller technology budgets</w:t>
-            </w:r>
-          </w:p>
-        </w:tc>
-        <w:tc>
-          <w:tcPr>
-            <w:tcW w:type="dxa" w:w="3096"/>
-          </w:tcPr>
-          <w:p>
-            <w:pPr>
-              <w:spacing w:after="0" w:line="240" w:lineRule="auto"/>
-            </w:pPr>
-            <w:r/>
-            <w:r>
-              <w:rPr>
-                <w:sz w:val="18"/>
-              </w:rPr>
-              <w:t>Adopting POS analytics and AI tools to offset labour shortages (TouchBistro, 2026)</w:t>
+              <w:t>Menu upgrades; loyalty partnership with Canadian Tire (Restaurant Brands International, 2026; Retail Insider, 2026)</w:t>
             </w:r>
           </w:p>
         </w:tc>
@@ -948,7 +1099,7 @@
       <w:tr>
         <w:tc>
           <w:tcPr>
-            <w:tcW w:type="dxa" w:w="1728"/>
+            <w:tcW w:type="dxa" w:w="1656"/>
             <w:shd w:val="clear" w:color="auto" w:fill="E8EEF5"/>
           </w:tcPr>
           <w:p>
@@ -961,13 +1112,13 @@
                 <w:b/>
                 <w:sz w:val="18"/>
               </w:rPr>
-              <w:t>Platforms and substitutes</w:t>
+              <w:t>McDonald’s Canada</w:t>
             </w:r>
           </w:p>
         </w:tc>
         <w:tc>
           <w:tcPr>
-            <w:tcW w:type="dxa" w:w="2664"/>
+            <w:tcW w:type="dxa" w:w="1656"/>
           </w:tcPr>
           <w:p>
             <w:pPr>
@@ -978,7 +1129,41 @@
               <w:rPr>
                 <w:sz w:val="18"/>
               </w:rPr>
-              <w:t>Airbnb, Uber Eats and DoorDash offer convenience and reach, and they own the customer relationship</w:t>
+              <w:t>Burger QSR / cost leadership</w:t>
+            </w:r>
+          </w:p>
+        </w:tc>
+        <w:tc>
+          <w:tcPr>
+            <w:tcW w:type="dxa" w:w="2160"/>
+          </w:tcPr>
+          <w:p>
+            <w:pPr>
+              <w:spacing w:after="0" w:line="240" w:lineRule="auto"/>
+            </w:pPr>
+            <w:r/>
+            <w:r>
+              <w:rPr>
+                <w:sz w:val="18"/>
+              </w:rPr>
+              <w:t>Global purchasing scale and marketing power</w:t>
+            </w:r>
+          </w:p>
+        </w:tc>
+        <w:tc>
+          <w:tcPr>
+            <w:tcW w:type="dxa" w:w="2016"/>
+          </w:tcPr>
+          <w:p>
+            <w:pPr>
+              <w:spacing w:after="0" w:line="240" w:lineRule="auto"/>
+            </w:pPr>
+            <w:r/>
+            <w:r>
+              <w:rPr>
+                <w:sz w:val="18"/>
+              </w:rPr>
+              <w:t>U.S. brand facing “Buy Canadian” sentiment</w:t>
             </w:r>
           </w:p>
         </w:tc>
@@ -995,13 +1180,34 @@
               <w:rPr>
                 <w:sz w:val="18"/>
               </w:rPr>
-              <w:t>Short-term rental limits (e.g., B.C.’s principal-residence rule) shrink Airbnb supply; restaurants resent high delivery commissions</w:t>
+              <w:t>One-year price lock on $5 McValue meals and $1 coffee (McDonald’s Canada, n.d.)</w:t>
+            </w:r>
+          </w:p>
+        </w:tc>
+      </w:tr>
+      <w:tr>
+        <w:tc>
+          <w:tcPr>
+            <w:tcW w:type="dxa" w:w="1656"/>
+            <w:shd w:val="clear" w:color="auto" w:fill="E8EEF5"/>
+          </w:tcPr>
+          <w:p>
+            <w:pPr>
+              <w:spacing w:after="0" w:line="240" w:lineRule="auto"/>
+            </w:pPr>
+            <w:r/>
+            <w:r>
+              <w:rPr>
+                <w:b/>
+                <w:sz w:val="18"/>
+              </w:rPr>
+              <w:t>A&amp;W Canada</w:t>
             </w:r>
           </w:p>
         </w:tc>
         <w:tc>
           <w:tcPr>
-            <w:tcW w:type="dxa" w:w="3096"/>
+            <w:tcW w:type="dxa" w:w="1656"/>
           </w:tcPr>
           <w:p>
             <w:pPr>
@@ -1012,7 +1218,681 @@
               <w:rPr>
                 <w:sz w:val="18"/>
               </w:rPr>
-              <w:t>Platforms keep adding paid memberships and advertising, which shifts margin away from operators</w:t>
+              <w:t>Burger QSR / differentiation</w:t>
+            </w:r>
+          </w:p>
+        </w:tc>
+        <w:tc>
+          <w:tcPr>
+            <w:tcW w:type="dxa" w:w="2160"/>
+          </w:tcPr>
+          <w:p>
+            <w:pPr>
+              <w:spacing w:after="0" w:line="240" w:lineRule="auto"/>
+            </w:pPr>
+            <w:r/>
+            <w:r>
+              <w:rPr>
+                <w:sz w:val="18"/>
+              </w:rPr>
+              <w:t>Canadian-owned; 1,000+ locations</w:t>
+            </w:r>
+          </w:p>
+        </w:tc>
+        <w:tc>
+          <w:tcPr>
+            <w:tcW w:type="dxa" w:w="2016"/>
+          </w:tcPr>
+          <w:p>
+            <w:pPr>
+              <w:spacing w:after="0" w:line="240" w:lineRule="auto"/>
+            </w:pPr>
+            <w:r/>
+            <w:r>
+              <w:rPr>
+                <w:sz w:val="18"/>
+              </w:rPr>
+              <w:t>Smaller marketing budget than McDonald’s</w:t>
+            </w:r>
+          </w:p>
+        </w:tc>
+        <w:tc>
+          <w:tcPr>
+            <w:tcW w:type="dxa" w:w="2520"/>
+          </w:tcPr>
+          <w:p>
+            <w:pPr>
+              <w:spacing w:after="0" w:line="240" w:lineRule="auto"/>
+            </w:pPr>
+            <w:r/>
+            <w:r>
+              <w:rPr>
+                <w:sz w:val="18"/>
+              </w:rPr>
+              <w:t>“Canadian owned and managed” signage (NOW Toronto, 2025)</w:t>
+            </w:r>
+          </w:p>
+        </w:tc>
+      </w:tr>
+      <w:tr>
+        <w:tc>
+          <w:tcPr>
+            <w:tcW w:type="dxa" w:w="1656"/>
+            <w:shd w:val="clear" w:color="auto" w:fill="E8EEF5"/>
+          </w:tcPr>
+          <w:p>
+            <w:pPr>
+              <w:spacing w:after="0" w:line="240" w:lineRule="auto"/>
+            </w:pPr>
+            <w:r/>
+            <w:r>
+              <w:rPr>
+                <w:b/>
+                <w:sz w:val="18"/>
+              </w:rPr>
+              <w:t>Recipe Unlimited</w:t>
+            </w:r>
+          </w:p>
+        </w:tc>
+        <w:tc>
+          <w:tcPr>
+            <w:tcW w:type="dxa" w:w="1656"/>
+          </w:tcPr>
+          <w:p>
+            <w:pPr>
+              <w:spacing w:after="0" w:line="240" w:lineRule="auto"/>
+            </w:pPr>
+            <w:r/>
+            <w:r>
+              <w:rPr>
+                <w:sz w:val="18"/>
+              </w:rPr>
+              <w:t>Casual dining / broad differentiation</w:t>
+            </w:r>
+          </w:p>
+        </w:tc>
+        <w:tc>
+          <w:tcPr>
+            <w:tcW w:type="dxa" w:w="2160"/>
+          </w:tcPr>
+          <w:p>
+            <w:pPr>
+              <w:spacing w:after="0" w:line="240" w:lineRule="auto"/>
+            </w:pPr>
+            <w:r/>
+            <w:r>
+              <w:rPr>
+                <w:sz w:val="18"/>
+              </w:rPr>
+              <w:t>Multi-brand portfolio (Swiss Chalet, Harvey’s, St-Hubert)</w:t>
+            </w:r>
+          </w:p>
+        </w:tc>
+        <w:tc>
+          <w:tcPr>
+            <w:tcW w:type="dxa" w:w="2016"/>
+          </w:tcPr>
+          <w:p>
+            <w:pPr>
+              <w:spacing w:after="0" w:line="240" w:lineRule="auto"/>
+            </w:pPr>
+            <w:r/>
+            <w:r>
+              <w:rPr>
+                <w:sz w:val="18"/>
+              </w:rPr>
+              <w:t>Casual dining is the most exposed to budget cuts</w:t>
+            </w:r>
+          </w:p>
+        </w:tc>
+        <w:tc>
+          <w:tcPr>
+            <w:tcW w:type="dxa" w:w="2520"/>
+          </w:tcPr>
+          <w:p>
+            <w:pPr>
+              <w:spacing w:after="0" w:line="240" w:lineRule="auto"/>
+            </w:pPr>
+            <w:r/>
+            <w:r>
+              <w:rPr>
+                <w:sz w:val="18"/>
+              </w:rPr>
+              <w:t>Bought all 8 Canadian Olive Gardens; national rollout (Recipe Restaurant Group International, 2026)</w:t>
+            </w:r>
+          </w:p>
+        </w:tc>
+      </w:tr>
+      <w:tr>
+        <w:tc>
+          <w:tcPr>
+            <w:tcW w:type="dxa" w:w="1656"/>
+            <w:shd w:val="clear" w:color="auto" w:fill="E8EEF5"/>
+          </w:tcPr>
+          <w:p>
+            <w:pPr>
+              <w:spacing w:after="0" w:line="240" w:lineRule="auto"/>
+            </w:pPr>
+            <w:r/>
+            <w:r>
+              <w:rPr>
+                <w:b/>
+                <w:sz w:val="18"/>
+              </w:rPr>
+              <w:t>MTY Food Group</w:t>
+            </w:r>
+          </w:p>
+        </w:tc>
+        <w:tc>
+          <w:tcPr>
+            <w:tcW w:type="dxa" w:w="1656"/>
+          </w:tcPr>
+          <w:p>
+            <w:pPr>
+              <w:spacing w:after="0" w:line="240" w:lineRule="auto"/>
+            </w:pPr>
+            <w:r/>
+            <w:r>
+              <w:rPr>
+                <w:sz w:val="18"/>
+              </w:rPr>
+              <w:t>Multi-brand franchisor / focus</w:t>
+            </w:r>
+          </w:p>
+        </w:tc>
+        <w:tc>
+          <w:tcPr>
+            <w:tcW w:type="dxa" w:w="2160"/>
+          </w:tcPr>
+          <w:p>
+            <w:pPr>
+              <w:spacing w:after="0" w:line="240" w:lineRule="auto"/>
+            </w:pPr>
+            <w:r/>
+            <w:r>
+              <w:rPr>
+                <w:sz w:val="18"/>
+              </w:rPr>
+              <w:t>7,040 locations across many brands</w:t>
+            </w:r>
+          </w:p>
+        </w:tc>
+        <w:tc>
+          <w:tcPr>
+            <w:tcW w:type="dxa" w:w="2016"/>
+          </w:tcPr>
+          <w:p>
+            <w:pPr>
+              <w:spacing w:after="0" w:line="240" w:lineRule="auto"/>
+            </w:pPr>
+            <w:r/>
+            <w:r>
+              <w:rPr>
+                <w:sz w:val="18"/>
+              </w:rPr>
+              <w:t>Canadian same-store sales down 1.8%</w:t>
+            </w:r>
+          </w:p>
+        </w:tc>
+        <w:tc>
+          <w:tcPr>
+            <w:tcW w:type="dxa" w:w="2520"/>
+          </w:tcPr>
+          <w:p>
+            <w:pPr>
+              <w:spacing w:after="0" w:line="240" w:lineRule="auto"/>
+            </w:pPr>
+            <w:r/>
+            <w:r>
+              <w:rPr>
+                <w:sz w:val="18"/>
+              </w:rPr>
+              <w:t>Closing 68 underperforming corporate stores (MTY Food Group, 2026)</w:t>
+            </w:r>
+          </w:p>
+        </w:tc>
+      </w:tr>
+      <w:tr>
+        <w:tc>
+          <w:tcPr>
+            <w:tcW w:type="dxa" w:w="1656"/>
+            <w:shd w:val="clear" w:color="auto" w:fill="E8EEF5"/>
+          </w:tcPr>
+          <w:p>
+            <w:pPr>
+              <w:spacing w:after="0" w:line="240" w:lineRule="auto"/>
+            </w:pPr>
+            <w:r/>
+            <w:r>
+              <w:rPr>
+                <w:b/>
+                <w:sz w:val="18"/>
+              </w:rPr>
+              <w:t>Marriott</w:t>
+            </w:r>
+          </w:p>
+        </w:tc>
+        <w:tc>
+          <w:tcPr>
+            <w:tcW w:type="dxa" w:w="1656"/>
+          </w:tcPr>
+          <w:p>
+            <w:pPr>
+              <w:spacing w:after="0" w:line="240" w:lineRule="auto"/>
+            </w:pPr>
+            <w:r/>
+            <w:r>
+              <w:rPr>
+                <w:sz w:val="18"/>
+              </w:rPr>
+              <w:t>Full portfolio / differentiation</w:t>
+            </w:r>
+          </w:p>
+        </w:tc>
+        <w:tc>
+          <w:tcPr>
+            <w:tcW w:type="dxa" w:w="2160"/>
+          </w:tcPr>
+          <w:p>
+            <w:pPr>
+              <w:spacing w:after="0" w:line="240" w:lineRule="auto"/>
+            </w:pPr>
+            <w:r/>
+            <w:r>
+              <w:rPr>
+                <w:sz w:val="18"/>
+              </w:rPr>
+              <w:t>300+ Canadian hotels; Bonvoy loyalty program</w:t>
+            </w:r>
+          </w:p>
+        </w:tc>
+        <w:tc>
+          <w:tcPr>
+            <w:tcW w:type="dxa" w:w="2016"/>
+          </w:tcPr>
+          <w:p>
+            <w:pPr>
+              <w:spacing w:after="0" w:line="240" w:lineRule="auto"/>
+            </w:pPr>
+            <w:r/>
+            <w:r>
+              <w:rPr>
+                <w:sz w:val="18"/>
+              </w:rPr>
+              <w:t>Relies on owners’ capital and rate growth</w:t>
+            </w:r>
+          </w:p>
+        </w:tc>
+        <w:tc>
+          <w:tcPr>
+            <w:tcW w:type="dxa" w:w="2520"/>
+          </w:tcPr>
+          <w:p>
+            <w:pPr>
+              <w:spacing w:after="0" w:line="240" w:lineRule="auto"/>
+            </w:pPr>
+            <w:r/>
+            <w:r>
+              <w:rPr>
+                <w:sz w:val="18"/>
+              </w:rPr>
+              <w:t>About 11 Canadian openings in 2026 (Rewards Canada, 2026)</w:t>
+            </w:r>
+          </w:p>
+        </w:tc>
+      </w:tr>
+      <w:tr>
+        <w:tc>
+          <w:tcPr>
+            <w:tcW w:type="dxa" w:w="1656"/>
+            <w:shd w:val="clear" w:color="auto" w:fill="E8EEF5"/>
+          </w:tcPr>
+          <w:p>
+            <w:pPr>
+              <w:spacing w:after="0" w:line="240" w:lineRule="auto"/>
+            </w:pPr>
+            <w:r/>
+            <w:r>
+              <w:rPr>
+                <w:b/>
+                <w:sz w:val="18"/>
+              </w:rPr>
+              <w:t>Hilton</w:t>
+            </w:r>
+          </w:p>
+        </w:tc>
+        <w:tc>
+          <w:tcPr>
+            <w:tcW w:type="dxa" w:w="1656"/>
+          </w:tcPr>
+          <w:p>
+            <w:pPr>
+              <w:spacing w:after="0" w:line="240" w:lineRule="auto"/>
+            </w:pPr>
+            <w:r/>
+            <w:r>
+              <w:rPr>
+                <w:sz w:val="18"/>
+              </w:rPr>
+              <w:t>Full portfolio / differentiation</w:t>
+            </w:r>
+          </w:p>
+        </w:tc>
+        <w:tc>
+          <w:tcPr>
+            <w:tcW w:type="dxa" w:w="2160"/>
+          </w:tcPr>
+          <w:p>
+            <w:pPr>
+              <w:spacing w:after="0" w:line="240" w:lineRule="auto"/>
+            </w:pPr>
+            <w:r/>
+            <w:r>
+              <w:rPr>
+                <w:sz w:val="18"/>
+              </w:rPr>
+              <w:t>200+ Canadian hotels; 100+ in pipeline</w:t>
+            </w:r>
+          </w:p>
+        </w:tc>
+        <w:tc>
+          <w:tcPr>
+            <w:tcW w:type="dxa" w:w="2016"/>
+          </w:tcPr>
+          <w:p>
+            <w:pPr>
+              <w:spacing w:after="0" w:line="240" w:lineRule="auto"/>
+            </w:pPr>
+            <w:r/>
+            <w:r>
+              <w:rPr>
+                <w:sz w:val="18"/>
+              </w:rPr>
+              <w:t>Exposed to softer occupancy</w:t>
+            </w:r>
+          </w:p>
+        </w:tc>
+        <w:tc>
+          <w:tcPr>
+            <w:tcW w:type="dxa" w:w="2520"/>
+          </w:tcPr>
+          <w:p>
+            <w:pPr>
+              <w:spacing w:after="0" w:line="240" w:lineRule="auto"/>
+            </w:pPr>
+            <w:r/>
+            <w:r>
+              <w:rPr>
+                <w:sz w:val="18"/>
+              </w:rPr>
+              <w:t>About 15 openings, including midscale Spark (RENX, 2026)</w:t>
+            </w:r>
+          </w:p>
+        </w:tc>
+      </w:tr>
+      <w:tr>
+        <w:tc>
+          <w:tcPr>
+            <w:tcW w:type="dxa" w:w="1656"/>
+            <w:shd w:val="clear" w:color="auto" w:fill="E8EEF5"/>
+          </w:tcPr>
+          <w:p>
+            <w:pPr>
+              <w:spacing w:after="0" w:line="240" w:lineRule="auto"/>
+            </w:pPr>
+            <w:r/>
+            <w:r>
+              <w:rPr>
+                <w:b/>
+                <w:sz w:val="18"/>
+              </w:rPr>
+              <w:t>Accor (Fairmont)</w:t>
+            </w:r>
+          </w:p>
+        </w:tc>
+        <w:tc>
+          <w:tcPr>
+            <w:tcW w:type="dxa" w:w="1656"/>
+          </w:tcPr>
+          <w:p>
+            <w:pPr>
+              <w:spacing w:after="0" w:line="240" w:lineRule="auto"/>
+            </w:pPr>
+            <w:r/>
+            <w:r>
+              <w:rPr>
+                <w:sz w:val="18"/>
+              </w:rPr>
+              <w:t>Luxury / differentiation</w:t>
+            </w:r>
+          </w:p>
+        </w:tc>
+        <w:tc>
+          <w:tcPr>
+            <w:tcW w:type="dxa" w:w="2160"/>
+          </w:tcPr>
+          <w:p>
+            <w:pPr>
+              <w:spacing w:after="0" w:line="240" w:lineRule="auto"/>
+            </w:pPr>
+            <w:r/>
+            <w:r>
+              <w:rPr>
+                <w:sz w:val="18"/>
+              </w:rPr>
+              <w:t>Iconic heritage hotels</w:t>
+            </w:r>
+          </w:p>
+        </w:tc>
+        <w:tc>
+          <w:tcPr>
+            <w:tcW w:type="dxa" w:w="2016"/>
+          </w:tcPr>
+          <w:p>
+            <w:pPr>
+              <w:spacing w:after="0" w:line="240" w:lineRule="auto"/>
+            </w:pPr>
+            <w:r/>
+            <w:r>
+              <w:rPr>
+                <w:sz w:val="18"/>
+              </w:rPr>
+              <w:t>High renovation costs</w:t>
+            </w:r>
+          </w:p>
+        </w:tc>
+        <w:tc>
+          <w:tcPr>
+            <w:tcW w:type="dxa" w:w="2520"/>
+          </w:tcPr>
+          <w:p>
+            <w:pPr>
+              <w:spacing w:after="0" w:line="240" w:lineRule="auto"/>
+            </w:pPr>
+            <w:r/>
+            <w:r>
+              <w:rPr>
+                <w:sz w:val="18"/>
+              </w:rPr>
+              <w:t>Renovating Fairmont Waterfront and Château Laurier; new Fairmont Calgary signed (Accor, 2026a, 2026b)</w:t>
+            </w:r>
+          </w:p>
+        </w:tc>
+      </w:tr>
+      <w:tr>
+        <w:tc>
+          <w:tcPr>
+            <w:tcW w:type="dxa" w:w="1656"/>
+            <w:shd w:val="clear" w:color="auto" w:fill="E8EEF5"/>
+          </w:tcPr>
+          <w:p>
+            <w:pPr>
+              <w:spacing w:after="0" w:line="240" w:lineRule="auto"/>
+            </w:pPr>
+            <w:r/>
+            <w:r>
+              <w:rPr>
+                <w:b/>
+                <w:sz w:val="18"/>
+              </w:rPr>
+              <w:t>Choice Hotels</w:t>
+            </w:r>
+          </w:p>
+        </w:tc>
+        <w:tc>
+          <w:tcPr>
+            <w:tcW w:type="dxa" w:w="1656"/>
+          </w:tcPr>
+          <w:p>
+            <w:pPr>
+              <w:spacing w:after="0" w:line="240" w:lineRule="auto"/>
+            </w:pPr>
+            <w:r/>
+            <w:r>
+              <w:rPr>
+                <w:sz w:val="18"/>
+              </w:rPr>
+              <w:t>Midscale franchising / cost focus</w:t>
+            </w:r>
+          </w:p>
+        </w:tc>
+        <w:tc>
+          <w:tcPr>
+            <w:tcW w:type="dxa" w:w="2160"/>
+          </w:tcPr>
+          <w:p>
+            <w:pPr>
+              <w:spacing w:after="0" w:line="240" w:lineRule="auto"/>
+            </w:pPr>
+            <w:r/>
+            <w:r>
+              <w:rPr>
+                <w:sz w:val="18"/>
+              </w:rPr>
+              <w:t>Low-cost franchise model; conversion brands</w:t>
+            </w:r>
+          </w:p>
+        </w:tc>
+        <w:tc>
+          <w:tcPr>
+            <w:tcW w:type="dxa" w:w="2016"/>
+          </w:tcPr>
+          <w:p>
+            <w:pPr>
+              <w:spacing w:after="0" w:line="240" w:lineRule="auto"/>
+            </w:pPr>
+            <w:r/>
+            <w:r>
+              <w:rPr>
+                <w:sz w:val="18"/>
+              </w:rPr>
+              <w:t>Limited presence in upscale</w:t>
+            </w:r>
+          </w:p>
+        </w:tc>
+        <w:tc>
+          <w:tcPr>
+            <w:tcW w:type="dxa" w:w="2520"/>
+          </w:tcPr>
+          <w:p>
+            <w:pPr>
+              <w:spacing w:after="0" w:line="240" w:lineRule="auto"/>
+            </w:pPr>
+            <w:r/>
+            <w:r>
+              <w:rPr>
+                <w:sz w:val="18"/>
+              </w:rPr>
+              <w:t>Six Ascend Collection hotels in Quebec (Hotel Investment Today, n.d.)</w:t>
+            </w:r>
+          </w:p>
+        </w:tc>
+      </w:tr>
+      <w:tr>
+        <w:tc>
+          <w:tcPr>
+            <w:tcW w:type="dxa" w:w="1656"/>
+            <w:shd w:val="clear" w:color="auto" w:fill="E8EEF5"/>
+          </w:tcPr>
+          <w:p>
+            <w:pPr>
+              <w:spacing w:after="0" w:line="240" w:lineRule="auto"/>
+            </w:pPr>
+            <w:r/>
+            <w:r>
+              <w:rPr>
+                <w:b/>
+                <w:sz w:val="18"/>
+              </w:rPr>
+              <w:t>Airbnb</w:t>
+            </w:r>
+          </w:p>
+        </w:tc>
+        <w:tc>
+          <w:tcPr>
+            <w:tcW w:type="dxa" w:w="1656"/>
+          </w:tcPr>
+          <w:p>
+            <w:pPr>
+              <w:spacing w:after="0" w:line="240" w:lineRule="auto"/>
+            </w:pPr>
+            <w:r/>
+            <w:r>
+              <w:rPr>
+                <w:sz w:val="18"/>
+              </w:rPr>
+              <w:t>Substitute / differentiation</w:t>
+            </w:r>
+          </w:p>
+        </w:tc>
+        <w:tc>
+          <w:tcPr>
+            <w:tcW w:type="dxa" w:w="2160"/>
+          </w:tcPr>
+          <w:p>
+            <w:pPr>
+              <w:spacing w:after="0" w:line="240" w:lineRule="auto"/>
+            </w:pPr>
+            <w:r/>
+            <w:r>
+              <w:rPr>
+                <w:sz w:val="18"/>
+              </w:rPr>
+              <w:t>Unique stays; global reach</w:t>
+            </w:r>
+          </w:p>
+        </w:tc>
+        <w:tc>
+          <w:tcPr>
+            <w:tcW w:type="dxa" w:w="2016"/>
+          </w:tcPr>
+          <w:p>
+            <w:pPr>
+              <w:spacing w:after="0" w:line="240" w:lineRule="auto"/>
+            </w:pPr>
+            <w:r/>
+            <w:r>
+              <w:rPr>
+                <w:sz w:val="18"/>
+              </w:rPr>
+              <w:t>Provincial and city rental restrictions</w:t>
+            </w:r>
+          </w:p>
+        </w:tc>
+        <w:tc>
+          <w:tcPr>
+            <w:tcW w:type="dxa" w:w="2520"/>
+          </w:tcPr>
+          <w:p>
+            <w:pPr>
+              <w:spacing w:after="0" w:line="240" w:lineRule="auto"/>
+            </w:pPr>
+            <w:r/>
+            <w:r>
+              <w:rPr>
+                <w:sz w:val="18"/>
+              </w:rPr>
+              <w:t>Must comply with B.C. and Toronto registration rules (Government of British Columbia, n.d.)</w:t>
             </w:r>
           </w:p>
         </w:tc>
@@ -1024,9 +1904,15 @@
       </w:pPr>
       <w:r>
         <w:rPr>
+          <w:b/>
+        </w:rPr>
+        <w:t xml:space="preserve">Takeaway: </w:t>
+      </w:r>
+      <w:r>
+        <w:rPr>
           <w:i w:val="0"/>
         </w:rPr>
-        <w:t>The competitive takeaway is that chains defend their share through scale, loyalty programs and data, while independents compete on local identity and authenticity. Hotel supply is still growing even as occupancy softens, so pricing power will weaken unless demand keeps pace.</w:t>
+        <w:t>Cost leaders (Tim Hortons, McDonald’s) are fighting a value war, while differentiators (A&amp;W, Fairmont, Marriott) compete on brand, loyalty and Canadian identity. Firms stuck in the middle, such as mid-priced casual dining, face the greatest risk.</w:t>
       </w:r>
     </w:p>
     <w:p>
@@ -1040,7 +1926,7 @@
           <w:color w:val="1F3A5F"/>
           <w:sz w:val="25"/>
         </w:rPr>
-        <w:t>4. Market Changes, Emerging Trends and Opportunities</w:t>
+        <w:t>4. Market Changes and Trends</w:t>
       </w:r>
     </w:p>
     <w:p>
@@ -1052,10 +1938,10 @@
         <w:rPr>
           <w:b/>
         </w:rPr>
-        <w:t xml:space="preserve">Travel spending has shifted toward Canada. </w:t>
+        <w:t xml:space="preserve">Shift to domestic travel. </w:t>
       </w:r>
       <w:r>
-        <w:t>Far fewer Canadians are driving south, and Restaurants Canada credits this redirected spending with part of the strength in 2025 sales. Opportunity: regional getaway packages, partnerships with national parks, and marketing aimed at Canadian travellers, especially outside Toronto and Vancouver.</w:t>
+        <w:t>Fewer U.S. trips plus the Canada Strong Pass favour regional hotels and destination restaurants.</w:t>
       </w:r>
     </w:p>
     <w:p>
@@ -1067,10 +1953,10 @@
         <w:rPr>
           <w:b/>
         </w:rPr>
-        <w:t xml:space="preserve">Big events help, but less than expected. </w:t>
+        <w:t xml:space="preserve">Events deliver less than expected. </w:t>
       </w:r>
       <w:r>
-        <w:t>During the 2026 FIFA World Cup, hotel occupancy actually dipped in Toronto and Vancouver, though higher rates offset part of the loss. Restaurants did better: card spending rose 12% and international visitors spent 57% more (CBC News, 2026; CoStar, 2026c). Opportunity: base event plans on data, not hype.</w:t>
+        <w:t>During the World Cup, Toronto’s hotel RevPAR rose 10.4% but Vancouver’s occupancy fell 15.8% (CoStar, 2026b). Toronto bar and restaurant card spending rose only 3% (34% among international visitors) (Toronto Life, 2026).</w:t>
       </w:r>
     </w:p>
     <w:p>
@@ -1082,10 +1968,10 @@
         <w:rPr>
           <w:b/>
         </w:rPr>
-        <w:t xml:space="preserve">Consumers want value and transparency. </w:t>
+        <w:t xml:space="preserve">Value and transparency. </w:t>
       </w:r>
       <w:r>
-        <w:t>TikTok “budget eats” and “is it worth it?” reviews draw large audiences, and tipping fatigue is widespread. Guests still spend, but only where the price feels fair. Opportunity: fixed-price menus, bundled hotel packages, and service-included pricing pilots.</w:t>
+        <w:t>TikTok “budget eats” content, price-lock offers and tipping fatigue all point to guests wanting fair, all-in pricing.</w:t>
       </w:r>
     </w:p>
     <w:p>
@@ -1097,10 +1983,10 @@
         <w:rPr>
           <w:b/>
         </w:rPr>
-        <w:t xml:space="preserve">Labour scarcity is speeding up automation. </w:t>
+        <w:t xml:space="preserve">Automation. </w:t>
       </w:r>
       <w:r>
-        <w:t>In early 2026, 46% of hotels lost temporary foreign workers to expiring permits, and 58% expect shortages over the next year (Hotelier Magazine, 2026). Opportunity: kiosks, mobile check-in and AI-assisted scheduling that let smaller teams deliver the same service.</w:t>
+        <w:t>58% of hoteliers expect labour shortages and 72% struggle to hire locally (Hotelier Magazine, 2026), which is pushing adoption of kiosks, mobile check-in and AI scheduling.</w:t>
       </w:r>
     </w:p>
     <w:p>
@@ -1112,10 +1998,10 @@
         <w:rPr>
           <w:b/>
         </w:rPr>
-        <w:t xml:space="preserve">Unstructured data is underused. </w:t>
+        <w:t xml:space="preserve">Unstructured data. </w:t>
       </w:r>
       <w:r>
-        <w:t>Reviews on Google, TripAdvisor and Reddit give honest feedback on service, cleanliness and value, yet most operators read them one by one. Opportunity: sentiment analysis that turns thousands of comments into measurable service priorities.</w:t>
+        <w:t>Reviews on Google, TripAdvisor and Reddit are an underused source of service insight.</w:t>
       </w:r>
     </w:p>
     <w:p>
@@ -1129,7 +2015,7 @@
           <w:color w:val="1F3A5F"/>
           <w:sz w:val="25"/>
         </w:rPr>
-        <w:t>5. Recommendations</w:t>
+        <w:t>5. Strategic Recommendations (TOWS)</w:t>
       </w:r>
     </w:p>
     <w:p>
@@ -1140,7 +2026,7 @@
         <w:rPr>
           <w:i w:val="0"/>
         </w:rPr>
-        <w:t>Each recommendation in Table 3 responds directly to a challenge identified above and comes with a business intelligence tool or KPI to track results.</w:t>
+        <w:t>Chains should defend cost leadership through scale and data. Independents should pursue focused differentiation, competing on local identity, experience and Canadian sourcing rather than price.</w:t>
       </w:r>
     </w:p>
     <w:tbl>
@@ -1151,9 +2037,9 @@
         <w:tblLook w:firstColumn="1" w:firstRow="1" w:lastColumn="0" w:lastRow="0" w:noHBand="0" w:noVBand="1" w:val="04A0"/>
       </w:tblPr>
       <w:tblGrid>
-        <w:gridCol w:w="1872"/>
-        <w:gridCol w:w="5112"/>
-        <w:gridCol w:w="3024"/>
+        <w:gridCol w:w="2088"/>
+        <w:gridCol w:w="5184"/>
+        <w:gridCol w:w="2736"/>
       </w:tblGrid>
       <w:tr>
         <w:trPr>
@@ -1161,7 +2047,7 @@
         </w:trPr>
         <w:tc>
           <w:tcPr>
-            <w:tcW w:type="dxa" w:w="1872"/>
+            <w:tcW w:type="dxa" w:w="2088"/>
             <w:shd w:val="clear" w:color="auto" w:fill="1F3A5F"/>
           </w:tcPr>
           <w:p>
@@ -1175,13 +2061,13 @@
                 <w:color w:val="FFFFFF"/>
                 <w:sz w:val="18"/>
               </w:rPr>
-              <w:t>Challenge</w:t>
+              <w:t>TOWS type</w:t>
             </w:r>
           </w:p>
         </w:tc>
         <w:tc>
           <w:tcPr>
-            <w:tcW w:type="dxa" w:w="5112"/>
+            <w:tcW w:type="dxa" w:w="5184"/>
             <w:shd w:val="clear" w:color="auto" w:fill="1F3A5F"/>
           </w:tcPr>
           <w:p>
@@ -1201,7 +2087,7 @@
         </w:tc>
         <w:tc>
           <w:tcPr>
-            <w:tcW w:type="dxa" w:w="3024"/>
+            <w:tcW w:type="dxa" w:w="2736"/>
             <w:shd w:val="clear" w:color="auto" w:fill="1F3A5F"/>
           </w:tcPr>
           <w:p>
@@ -1223,7 +2109,7 @@
       <w:tr>
         <w:tc>
           <w:tcPr>
-            <w:tcW w:type="dxa" w:w="1872"/>
+            <w:tcW w:type="dxa" w:w="2088"/>
             <w:shd w:val="clear" w:color="auto" w:fill="E8EEF5"/>
           </w:tcPr>
           <w:p>
@@ -1236,13 +2122,13 @@
                 <w:b/>
                 <w:sz w:val="18"/>
               </w:rPr>
-              <w:t>Margin squeeze</w:t>
+              <w:t>SO (strength to opportunity)</w:t>
             </w:r>
           </w:p>
         </w:tc>
         <w:tc>
           <w:tcPr>
-            <w:tcW w:type="dxa" w:w="5112"/>
+            <w:tcW w:type="dxa" w:w="5184"/>
           </w:tcPr>
           <w:p>
             <w:pPr>
@@ -1253,13 +2139,13 @@
               <w:rPr>
                 <w:sz w:val="18"/>
               </w:rPr>
-              <w:t>Restaurants: use menu engineering to cut or reprice low-margin items, and renegotiate supplier contracts. Hotels: grow ancillary revenue (parking, food and beverage, early check-in) instead of relying on room rate alone.</w:t>
+              <w:t>Use loyalty data to build packages for Canadian travellers with tourism boards and promote Canadian sourcing.</w:t>
             </w:r>
           </w:p>
         </w:tc>
         <w:tc>
           <w:tcPr>
-            <w:tcW w:type="dxa" w:w="3024"/>
+            <w:tcW w:type="dxa" w:w="2736"/>
           </w:tcPr>
           <w:p>
             <w:pPr>
@@ -1270,7 +2156,7 @@
               <w:rPr>
                 <w:sz w:val="18"/>
               </w:rPr>
-              <w:t>Weekly cost dashboard; prime cost (food + labour) at 60–65% of sales; GOPPAR</w:t>
+              <w:t>Domestic booking share; package uptake</w:t>
             </w:r>
           </w:p>
         </w:tc>
@@ -1278,7 +2164,7 @@
       <w:tr>
         <w:tc>
           <w:tcPr>
-            <w:tcW w:type="dxa" w:w="1872"/>
+            <w:tcW w:type="dxa" w:w="2088"/>
             <w:shd w:val="clear" w:color="auto" w:fill="E8EEF5"/>
           </w:tcPr>
           <w:p>
@@ -1291,13 +2177,13 @@
                 <w:b/>
                 <w:sz w:val="18"/>
               </w:rPr>
-              <w:t>Labour shortages and rising wages</w:t>
+              <w:t>WO (fix weakness via opportunity)</w:t>
             </w:r>
           </w:p>
         </w:tc>
         <w:tc>
           <w:tcPr>
-            <w:tcW w:type="dxa" w:w="5112"/>
+            <w:tcW w:type="dxa" w:w="5184"/>
           </w:tcPr>
           <w:p>
             <w:pPr>
@@ -1308,13 +2194,13 @@
               <w:rPr>
                 <w:sz w:val="18"/>
               </w:rPr>
-              <w:t>Schedule staff based on demand forecasts from POS and booking history. Cross-train employees, and invest in retention (staff housing in resort towns, clear career paths) instead of relying on temporary foreign workers.</w:t>
+              <w:t>Combine PMS, POS, reservation and loyalty data in a data warehouse, with consent collected under PIPEDA and Law 25. Add sentiment analysis of reviews.</w:t>
             </w:r>
           </w:p>
         </w:tc>
         <w:tc>
           <w:tcPr>
-            <w:tcW w:type="dxa" w:w="3024"/>
+            <w:tcW w:type="dxa" w:w="2736"/>
           </w:tcPr>
           <w:p>
             <w:pPr>
@@ -1325,7 +2211,7 @@
               <w:rPr>
                 <w:sz w:val="18"/>
               </w:rPr>
-              <w:t>Sales per labour hour; staff turnover rate</w:t>
+              <w:t>Repeat-guest rate; sentiment score</w:t>
             </w:r>
           </w:p>
         </w:tc>
@@ -1333,7 +2219,7 @@
       <w:tr>
         <w:tc>
           <w:tcPr>
-            <w:tcW w:type="dxa" w:w="1872"/>
+            <w:tcW w:type="dxa" w:w="2088"/>
             <w:shd w:val="clear" w:color="auto" w:fill="E8EEF5"/>
           </w:tcPr>
           <w:p>
@@ -1346,13 +2232,13 @@
                 <w:b/>
                 <w:sz w:val="18"/>
               </w:rPr>
-              <w:t>Value-sensitive, fee-averse guests</w:t>
+              <w:t>ST (strength against threat)</w:t>
             </w:r>
           </w:p>
         </w:tc>
         <w:tc>
           <w:tcPr>
-            <w:tcW w:type="dxa" w:w="5112"/>
+            <w:tcW w:type="dxa" w:w="5184"/>
           </w:tcPr>
           <w:p>
             <w:pPr>
@@ -1363,13 +2249,13 @@
               <w:rPr>
                 <w:sz w:val="18"/>
               </w:rPr>
-              <w:t>Advertise all-in prices, offer prix fixe menus and bundled stays, and test lower default tip prompts or service-included pricing.</w:t>
+              <w:t>Answer the value war with all-in pricing, prix fixe menus and bundled stays. Grow ancillary hotel revenue rather than relying on room rate alone.</w:t>
             </w:r>
           </w:p>
         </w:tc>
         <w:tc>
           <w:tcPr>
-            <w:tcW w:type="dxa" w:w="3024"/>
+            <w:tcW w:type="dxa" w:w="2736"/>
           </w:tcPr>
           <w:p>
             <w:pPr>
@@ -1380,7 +2266,7 @@
               <w:rPr>
                 <w:sz w:val="18"/>
               </w:rPr>
-              <w:t>Average cheque; visit frequency; review sentiment on “price”</w:t>
+              <w:t>Average cheque; GOPPAR; visit frequency</w:t>
             </w:r>
           </w:p>
         </w:tc>
@@ -1388,7 +2274,7 @@
       <w:tr>
         <w:tc>
           <w:tcPr>
-            <w:tcW w:type="dxa" w:w="1872"/>
+            <w:tcW w:type="dxa" w:w="2088"/>
             <w:shd w:val="clear" w:color="auto" w:fill="E8EEF5"/>
           </w:tcPr>
           <w:p>
@@ -1401,13 +2287,13 @@
                 <w:b/>
                 <w:sz w:val="18"/>
               </w:rPr>
-              <w:t>Shift to domestic travel and Buy Canadian</w:t>
+              <w:t>WT (minimize weakness and threat)</w:t>
             </w:r>
           </w:p>
         </w:tc>
         <w:tc>
           <w:tcPr>
-            <w:tcW w:type="dxa" w:w="5112"/>
+            <w:tcW w:type="dxa" w:w="5184"/>
           </w:tcPr>
           <w:p>
             <w:pPr>
@@ -1418,13 +2304,13 @@
               <w:rPr>
                 <w:sz w:val="18"/>
               </w:rPr>
-              <w:t>Build packages for Canadian travellers with local tourism boards, and promote Canadian suppliers on menus and in hotel amenities.</w:t>
+              <w:t>Use menu engineering and demand-based scheduling, cross-train staff, and invest in retention (for example, staff housing in resort towns).</w:t>
             </w:r>
           </w:p>
         </w:tc>
         <w:tc>
           <w:tcPr>
-            <w:tcW w:type="dxa" w:w="3024"/>
+            <w:tcW w:type="dxa" w:w="2736"/>
           </w:tcPr>
           <w:p>
             <w:pPr>
@@ -1435,117 +2321,7 @@
               <w:rPr>
                 <w:sz w:val="18"/>
               </w:rPr>
-              <w:t>Share of domestic bookings; package uptake</w:t>
-            </w:r>
-          </w:p>
-        </w:tc>
-      </w:tr>
-      <w:tr>
-        <w:tc>
-          <w:tcPr>
-            <w:tcW w:type="dxa" w:w="1872"/>
-            <w:shd w:val="clear" w:color="auto" w:fill="E8EEF5"/>
-          </w:tcPr>
-          <w:p>
-            <w:pPr>
-              <w:spacing w:after="0" w:line="240" w:lineRule="auto"/>
-            </w:pPr>
-            <w:r/>
-            <w:r>
-              <w:rPr>
-                <w:b/>
-                <w:sz w:val="18"/>
-              </w:rPr>
-              <w:t>Data that goes unused</w:t>
-            </w:r>
-          </w:p>
-        </w:tc>
-        <w:tc>
-          <w:tcPr>
-            <w:tcW w:type="dxa" w:w="5112"/>
-          </w:tcPr>
-          <w:p>
-            <w:pPr>
-              <w:spacing w:after="0" w:line="240" w:lineRule="auto"/>
-            </w:pPr>
-            <w:r/>
-            <w:r>
-              <w:rPr>
-                <w:sz w:val="18"/>
-              </w:rPr>
-              <w:t>Combine PMS, POS, reservation and loyalty data in a data warehouse to create a single view of each guest. Collect consent in line with PIPEDA and Quebec’s Law 25.</w:t>
-            </w:r>
-          </w:p>
-        </w:tc>
-        <w:tc>
-          <w:tcPr>
-            <w:tcW w:type="dxa" w:w="3024"/>
-          </w:tcPr>
-          <w:p>
-            <w:pPr>
-              <w:spacing w:after="0" w:line="240" w:lineRule="auto"/>
-            </w:pPr>
-            <w:r/>
-            <w:r>
-              <w:rPr>
-                <w:sz w:val="18"/>
-              </w:rPr>
-              <w:t>Repeat-guest rate; guest lifetime value; sentiment score</w:t>
-            </w:r>
-          </w:p>
-        </w:tc>
-      </w:tr>
-      <w:tr>
-        <w:tc>
-          <w:tcPr>
-            <w:tcW w:type="dxa" w:w="1872"/>
-            <w:shd w:val="clear" w:color="auto" w:fill="E8EEF5"/>
-          </w:tcPr>
-          <w:p>
-            <w:pPr>
-              <w:spacing w:after="0" w:line="240" w:lineRule="auto"/>
-            </w:pPr>
-            <w:r/>
-            <w:r>
-              <w:rPr>
-                <w:b/>
-                <w:sz w:val="18"/>
-              </w:rPr>
-              <w:t>Climate and event volatility</w:t>
-            </w:r>
-          </w:p>
-        </w:tc>
-        <w:tc>
-          <w:tcPr>
-            <w:tcW w:type="dxa" w:w="5112"/>
-          </w:tcPr>
-          <w:p>
-            <w:pPr>
-              <w:spacing w:after="0" w:line="240" w:lineRule="auto"/>
-            </w:pPr>
-            <w:r/>
-            <w:r>
-              <w:rPr>
-                <w:sz w:val="18"/>
-              </w:rPr>
-              <w:t>Build demand forecasts that include event calendars and weather. Plan scenarios for wildfire season and offer flexible cancellation policies.</w:t>
-            </w:r>
-          </w:p>
-        </w:tc>
-        <w:tc>
-          <w:tcPr>
-            <w:tcW w:type="dxa" w:w="3024"/>
-          </w:tcPr>
-          <w:p>
-            <w:pPr>
-              <w:spacing w:after="0" w:line="240" w:lineRule="auto"/>
-            </w:pPr>
-            <w:r/>
-            <w:r>
-              <w:rPr>
-                <w:sz w:val="18"/>
-              </w:rPr>
-              <w:t>Forecast accuracy; revenue lost to closures</w:t>
+              <w:t>Prime cost at 60–65% of sales; sales per labour hour; turnover</w:t>
             </w:r>
           </w:p>
         </w:tc>
@@ -1559,7 +2335,7 @@
         <w:rPr>
           <w:i w:val="0"/>
         </w:rPr>
-        <w:t>Implementation can be phased. In the first three months, launch the cost dashboard and the pricing changes. From months three to twelve, build the data warehouse, forecasting and sentiment analysis.</w:t>
+        <w:t>Phasing: launch cost dashboards and pricing changes within three months, and build the data warehouse and forecasting within twelve.</w:t>
       </w:r>
     </w:p>
     <w:p>
@@ -1581,7 +2357,7 @@
         <w:rPr>
           <w:i w:val="0"/>
         </w:rPr>
-        <w:t>Canadian hospitality is not short of demand. Domestic travel, major events and loyal local customers keep people coming through the doors. What it is short of is margin and workers. The operators that will do well are the ones that treat data as a strategic asset: tracking costs every week, listening to guests at scale, and planning around evidence instead of hype.</w:t>
+        <w:t>Canadian hospitality still has demand, but it lacks margin and workers. The operators that win will choose a clear generic strategy and support it with data, tracking costs weekly, listening to guests at scale, and planning around evidence rather than hype.</w:t>
       </w:r>
     </w:p>
     <w:p>
@@ -1605,7 +2381,31 @@
       </w:pPr>
       <w:r>
         <w:rPr>
-          <w:sz w:val="18"/>
+          <w:sz w:val="17"/>
+        </w:rPr>
+        <w:t>Accor. (2026a). Fairmont Hotels &amp; Resorts announces signing of Fairmont Calgary [Press release]. https://press.accor.com/?p=58619</w:t>
+      </w:r>
+    </w:p>
+    <w:p>
+      <w:pPr>
+        <w:spacing w:after="20" w:line="240" w:lineRule="auto"/>
+        <w:ind w:left="576" w:hanging="576"/>
+      </w:pPr>
+      <w:r>
+        <w:rPr>
+          <w:sz w:val="17"/>
+        </w:rPr>
+        <w:t>Accor. (2026b). Fairmont Hotels &amp; Resorts elevates luxury experience with landmark global renovations [Press release]. https://press.accor.com/fairmont-hotels-resorts-elevates-luxury-experience-with-landmark-global-renovations/?lang=eng</w:t>
+      </w:r>
+    </w:p>
+    <w:p>
+      <w:pPr>
+        <w:spacing w:after="20" w:line="240" w:lineRule="auto"/>
+        <w:ind w:left="576" w:hanging="576"/>
+      </w:pPr>
+      <w:r>
+        <w:rPr>
+          <w:sz w:val="17"/>
         </w:rPr>
         <w:t>Angus Reid Institute. (2023, February 16). Tipping in Canada: How tipflation and tip creep are testing consumer patience. https://angusreid.org/canada-tipping-service-hospitality-included-tipflation-tip-creep/</w:t>
       </w:r>
@@ -1617,19 +2417,7 @@
       </w:pPr>
       <w:r>
         <w:rPr>
-          <w:sz w:val="18"/>
-        </w:rPr>
-        <w:t>CBC News. (2026). Toronto saw little economic gain during World Cup’s first 2 weeks in city, data shows. https://www.cbc.ca/news/canada/toronto/economic-impact-toronto-fifa-9.7258589</w:t>
-      </w:r>
-    </w:p>
-    <w:p>
-      <w:pPr>
-        <w:spacing w:after="20" w:line="240" w:lineRule="auto"/>
-        <w:ind w:left="576" w:hanging="576"/>
-      </w:pPr>
-      <w:r>
-        <w:rPr>
-          <w:sz w:val="18"/>
+          <w:sz w:val="17"/>
         </w:rPr>
         <w:t>CoStar. (2026a). Canada hotels post record-setting performance in 2025. https://www.costar.com/products/str-benchmark/resources/press-releases/canada-hotels-post-record-setting-performance-2025</w:t>
       </w:r>
@@ -1641,7 +2429,7 @@
       </w:pPr>
       <w:r>
         <w:rPr>
-          <w:sz w:val="18"/>
+          <w:sz w:val="17"/>
         </w:rPr>
         <w:t>CoStar. (2026b). Canada hotels report first monthly occupancy decline of 2026. https://www.costar.com/products/str-benchmark/resources/press-releases/canada-hotels-report-first-monthly-occupancy</w:t>
       </w:r>
@@ -1653,9 +2441,9 @@
       </w:pPr>
       <w:r>
         <w:rPr>
-          <w:sz w:val="18"/>
+          <w:sz w:val="17"/>
         </w:rPr>
-        <w:t>CoStar. (2026c). World Cup’s impact on hotels in Canada underperforms that in US. https://www.costar.com/article/510500866/world-cups-impact-on-hotels-in-canada-underperforms-that-in-us</w:t>
+        <w:t>Davies Ward Phillips &amp; Vineberg. (2024). Navigating the new norm: Further changes to Canada’s Competition Act in effect. https://www.dwpv.com/insights/2024/further-changes-to-canada-competition-act</w:t>
       </w:r>
     </w:p>
     <w:p>
@@ -1665,9 +2453,9 @@
       </w:pPr>
       <w:r>
         <w:rPr>
-          <w:sz w:val="18"/>
+          <w:sz w:val="17"/>
         </w:rPr>
-        <w:t>Foodservice and Hospitality. (2026). Rising costs outpace sales growth. https://www.foodserviceandhospitality.com/rising-costs-outpace-sales-growth/</w:t>
+        <w:t>Government of British Columbia. (n.d.). What visitors need to know about B.C.’s new short-term rental rules. https://www2.gov.bc.ca/gov/content/housing-tenancy/short-term-rentals/information/visitors</w:t>
       </w:r>
     </w:p>
     <w:p>
@@ -1677,19 +2465,7 @@
       </w:pPr>
       <w:r>
         <w:rPr>
-          <w:sz w:val="18"/>
-        </w:rPr>
-        <w:t>The Hill Times. (2026, September 29). Feds should reconsider “blanket reductions” of temporary residents, say critics as new data shows record drop. https://hilltimes.com/2026/09/29/feds-should-reconsider-blanket-reductions-of-temporary-residents-say-critics-as-new-data-shows-record-drop/519771</w:t>
-      </w:r>
-    </w:p>
-    <w:p>
-      <w:pPr>
-        <w:spacing w:after="20" w:line="240" w:lineRule="auto"/>
-        <w:ind w:left="576" w:hanging="576"/>
-      </w:pPr>
-      <w:r>
-        <w:rPr>
-          <w:sz w:val="18"/>
+          <w:sz w:val="17"/>
         </w:rPr>
         <w:t>Hotel Investment Today. (n.d.). Choice continues growth in Canada. https://www.hotelinvestmenttoday.com/Development/Brands/Choice-continues-growth-in-Canada</w:t>
       </w:r>
@@ -1701,7 +2477,7 @@
       </w:pPr>
       <w:r>
         <w:rPr>
-          <w:sz w:val="18"/>
+          <w:sz w:val="17"/>
         </w:rPr>
         <w:t>Hotelier Magazine. (2026). Hotels Canada report highlights workforce concerns. https://www.hoteliermagazine.com/hotels-canada-report-highlights-workforce-concerns/</w:t>
       </w:r>
@@ -1713,7 +2489,7 @@
       </w:pPr>
       <w:r>
         <w:rPr>
-          <w:sz w:val="18"/>
+          <w:sz w:val="17"/>
         </w:rPr>
         <w:t>Littler. (2026). Canada: Minimum wage increases in 2026. https://www.littler.com/news-analysis/asap/canada-minimum-wage-increases-2026</w:t>
       </w:r>
@@ -1725,7 +2501,31 @@
       </w:pPr>
       <w:r>
         <w:rPr>
-          <w:sz w:val="18"/>
+          <w:sz w:val="17"/>
+        </w:rPr>
+        <w:t>McDonald’s Canada. (n.d.). McDonald’s Canada announces one-year price promise on $5 McValue meals and $1 small McCafé coffee. https://www.mcdonalds.com/ca/en-ca/newsroom/article/McDonald-s-Canada-Announces-One-Year-Price-Promise-on--5-McValue--Meals-and--1-small-McCaf---Coffee-.html</w:t>
+      </w:r>
+    </w:p>
+    <w:p>
+      <w:pPr>
+        <w:spacing w:after="20" w:line="240" w:lineRule="auto"/>
+        <w:ind w:left="576" w:hanging="576"/>
+      </w:pPr>
+      <w:r>
+        <w:rPr>
+          <w:sz w:val="17"/>
+        </w:rPr>
+        <w:t>MTY Food Group. (2026, July 10). MTY reports second quarter results for fiscal 2026 [Press release]. GlobeNewswire. https://www.globenewswire.com/news-release/2026/07/10/3325397/0/en/mty-reports-second-quarter-results-for-fiscal-2026.html</w:t>
+      </w:r>
+    </w:p>
+    <w:p>
+      <w:pPr>
+        <w:spacing w:after="20" w:line="240" w:lineRule="auto"/>
+        <w:ind w:left="576" w:hanging="576"/>
+      </w:pPr>
+      <w:r>
+        <w:rPr>
+          <w:sz w:val="17"/>
         </w:rPr>
         <w:t>NOW Toronto. (2025). “The food is 100 times better,” Canadians are rooting for A&amp;W over McDonald’s amid trade war. https://nowtoronto.com/culture/canadians-rooting-for-canadian-burger-franchise/</w:t>
       </w:r>
@@ -1737,7 +2537,31 @@
       </w:pPr>
       <w:r>
         <w:rPr>
-          <w:sz w:val="18"/>
+          <w:sz w:val="17"/>
+        </w:rPr>
+        <w:t>Parks Canada. (n.d.). Free admission and discounted overnight stays with Parks Canada. https://parks.canada.ca/voyage-travel/conseils-tips/choisis-canada-choose/admission-camping</w:t>
+      </w:r>
+    </w:p>
+    <w:p>
+      <w:pPr>
+        <w:spacing w:after="20" w:line="240" w:lineRule="auto"/>
+        <w:ind w:left="576" w:hanging="576"/>
+      </w:pPr>
+      <w:r>
+        <w:rPr>
+          <w:sz w:val="17"/>
+        </w:rPr>
+        <w:t>Recipe Restaurant Group International. (2026, January 15). Recipe Restaurant Group International announces next phase of Olive Garden expansion in Canada [Press release]. https://recipeunlimited.investorroom.com/2026-01-15-Recipe-Restaurant-Group-International-Announces-Next-Phase-of-Olive-Garden-Expansion-in-Canada</w:t>
+      </w:r>
+    </w:p>
+    <w:p>
+      <w:pPr>
+        <w:spacing w:after="20" w:line="240" w:lineRule="auto"/>
+        <w:ind w:left="576" w:hanging="576"/>
+      </w:pPr>
+      <w:r>
+        <w:rPr>
+          <w:sz w:val="17"/>
         </w:rPr>
         <w:t>RENX. (2026). Hilton plans 15 new hotels in Canada in 2026. https://renx.ca/index.php/hilton-continues-to-expand-in-canada</w:t>
       </w:r>
@@ -1749,7 +2573,7 @@
       </w:pPr>
       <w:r>
         <w:rPr>
-          <w:sz w:val="18"/>
+          <w:sz w:val="17"/>
         </w:rPr>
         <w:t>Restaurant Brands International. (2026). Form 10-Q for the quarterly period ended June 30, 2026. U.S. Securities and Exchange Commission. https://www.sec.gov/Archives/edgar/data/0001618756/000161875626000045/qsr-20260630.htm</w:t>
       </w:r>
@@ -1761,9 +2585,9 @@
       </w:pPr>
       <w:r>
         <w:rPr>
-          <w:sz w:val="18"/>
+          <w:sz w:val="17"/>
         </w:rPr>
-        <w:t>Restaurants Canada. (2026). 2025 foodservice sales buffered by GST holiday as rising operating costs and tariffs cut into profits—Restaurants brace for more obstacles in 2026. https://www.restaurantscanada.org/2025-foodservice-sales-buffered-by-gst-holiday-as-rising-operating-costs-and-tariffs-cut-into-profits-restaurants-brace-for-more-obstacles-in-2026/</w:t>
+        <w:t>Restaurants Canada. (2026a). Eight in 10 Canadians are cutting back on restaurant visits as affordability pressures worsen. https://www.restaurantscanada.org/eight-in-10-canadians-are-cutting-back-on-restaurant-visits-as-affordability-pressures-worsen/</w:t>
       </w:r>
     </w:p>
     <w:p>
@@ -1773,9 +2597,9 @@
       </w:pPr>
       <w:r>
         <w:rPr>
-          <w:sz w:val="18"/>
+          <w:sz w:val="17"/>
         </w:rPr>
-        <w:t>Retail Insider. (2026a, February). Tim Hortons upgrades muffins, espresso and drinks. https://retail-insider.com/retail-insider/2026/02/tim-hortons-upgrades-muffins-espresso-and-drinks/</w:t>
+        <w:t>Restaurants Canada. (2026b). Rising costs outpace sales growth, eroding restaurant profitability, new report finds. https://www.restaurantscanada.org/rising-costs-outpace-sales-growth-eroding-restaurant-profitability-new-report-finds/</w:t>
       </w:r>
     </w:p>
     <w:p>
@@ -1785,9 +2609,9 @@
       </w:pPr>
       <w:r>
         <w:rPr>
-          <w:sz w:val="18"/>
+          <w:sz w:val="17"/>
         </w:rPr>
-        <w:t>Retail Insider. (2026b, August). Tim Hortons targets stronger Canadian growth with new stores, beverages and loyalty. https://retail-insider.com/retail-insider/2026/08/tim-hortons-targets-stronger-canadian-growth-with-new-stores-beverages-and-loyalty/</w:t>
+        <w:t>Retail Insider. (2026, August). Tim Hortons targets stronger Canadian growth with new stores, beverages and loyalty. https://retail-insider.com/retail-insider/2026/08/tim-hortons-targets-stronger-canadian-growth-with-new-stores-beverages-and-loyalty/</w:t>
       </w:r>
     </w:p>
     <w:p>
@@ -1797,7 +2621,7 @@
       </w:pPr>
       <w:r>
         <w:rPr>
-          <w:sz w:val="18"/>
+          <w:sz w:val="17"/>
         </w:rPr>
         <w:t>Rewards Canada. (2026). Marriott’s new hotel openings in Canada for 2026. https://blog.rewardscanada.ca/new-hotels/new-marriott-hotels-2026/</w:t>
       </w:r>
@@ -1809,7 +2633,7 @@
       </w:pPr>
       <w:r>
         <w:rPr>
-          <w:sz w:val="18"/>
+          <w:sz w:val="17"/>
         </w:rPr>
         <w:t>Statistics Canada. (2026a, February 23). Travel between Canada and other countries, December 2025. The Daily. https://www150.statcan.gc.ca/n1/daily-quotidien/260223/dq260223a-eng.htm</w:t>
       </w:r>
@@ -1821,7 +2645,7 @@
       </w:pPr>
       <w:r>
         <w:rPr>
-          <w:sz w:val="18"/>
+          <w:sz w:val="17"/>
         </w:rPr>
         <w:t>Statistics Canada. (2026b, April 23). Travel between Canada and other countries, February 2026. The Daily. https://www150.statcan.gc.ca/n1/daily-quotidien/260423/dq260423b-eng.htm</w:t>
       </w:r>
@@ -1833,7 +2657,19 @@
       </w:pPr>
       <w:r>
         <w:rPr>
-          <w:sz w:val="18"/>
+          <w:sz w:val="17"/>
+        </w:rPr>
+        <w:t>Toronto Life. (2026). Total spending at Toronto bars and restaurants was only three per cent higher than usual during the World Cup. https://torontolife.com/city/total-spending-at-toronto-bars-and-restaurants-was-only-three-per-cent-higher-than-usual-during-the-world-cup/</w:t>
+      </w:r>
+    </w:p>
+    <w:p>
+      <w:pPr>
+        <w:spacing w:after="20" w:line="240" w:lineRule="auto"/>
+        <w:ind w:left="576" w:hanging="576"/>
+      </w:pPr>
+      <w:r>
+        <w:rPr>
+          <w:sz w:val="17"/>
         </w:rPr>
         <w:t>TouchBistro. (2026, January 27). Restaurants post strong margins in uneven recovery: TouchBistro’s 2026 Canadian State of Restaurants Report [Press release]. Business Wire. https://www.businesswire.com/news/home/20260127249555/en/</w:t>
       </w:r>

</xml_diff>